<commit_message>
Organizacion y limpieza del proyecto: eliminacion de respaldos obsoletos, inclusion de README, actualizacion de dependencias y nuevo menu de Actualizacion y Ampliaciones
</commit_message>
<xml_diff>
--- a/plantillas/plantilla_informe.docx
+++ b/plantillas/plantilla_informe.docx
@@ -497,7 +497,7 @@
       </w:tr>
       <w:tr>
         <w:trPr>
-          <w:trHeight w:val="472"/>
+          <w:trHeight w:val="1170"/>
         </w:trPr>
         <w:tc>
           <w:tcPr>
@@ -609,6 +609,8 @@
               </w:rPr>
               <w:t>_INFORME_SUCCOR }}</w:t>
             </w:r>
+            <w:bookmarkStart w:id="0" w:name="_GoBack"/>
+            <w:bookmarkEnd w:id="0"/>
           </w:p>
           <w:p>
             <w:pPr>
@@ -1174,7 +1176,7 @@
         </w:rPr>
         <w:t xml:space="preserve">Mediante el </w:t>
       </w:r>
-      <w:bookmarkStart w:id="0" w:name="NOMBRE_INFORME_SUCOR"/>
+      <w:bookmarkStart w:id="1" w:name="NOMBRE_INFORME_SUCOR"/>
       <w:r>
         <w:rPr>
           <w:sz w:val="22"/>
@@ -1210,7 +1212,7 @@
         </w:rPr>
         <w:t>-2026-MINEDU/VMGI-PRONABEC-DICONCI-SUCCOR-LIMA</w:t>
       </w:r>
-      <w:bookmarkEnd w:id="0"/>
+      <w:bookmarkEnd w:id="1"/>
       <w:r>
         <w:rPr>
           <w:sz w:val="22"/>
@@ -1218,7 +1220,7 @@
         </w:rPr>
         <w:t xml:space="preserve">, la </w:t>
       </w:r>
-      <w:bookmarkStart w:id="1" w:name="_Hlk235083279"/>
+      <w:bookmarkStart w:id="2" w:name="_Hlk235083279"/>
       <w:r>
         <w:rPr>
           <w:sz w:val="22"/>
@@ -1226,7 +1228,7 @@
         </w:rPr>
         <w:t>Subdirección de Coordinación y Cooperación Regional Lima</w:t>
       </w:r>
-      <w:bookmarkEnd w:id="1"/>
+      <w:bookmarkEnd w:id="2"/>
       <w:r>
         <w:rPr>
           <w:sz w:val="22"/>
@@ -1445,7 +1447,7 @@
                 <w:lang w:val="es-ES" w:eastAsia="es-ES"/>
               </w:rPr>
             </w:pPr>
-            <w:bookmarkStart w:id="2" w:name="SEXO_LABEL_TABLA"/>
+            <w:bookmarkStart w:id="3" w:name="SEXO_LABEL_TABLA"/>
             <w:r>
               <w:rPr>
                 <w:rFonts w:ascii="Arial" w:eastAsia="Times New Roman" w:hAnsi="Arial" w:cs="Arial"/>
@@ -1456,7 +1458,7 @@
               </w:rPr>
               <w:t>BECARIO/A</w:t>
             </w:r>
-            <w:bookmarkEnd w:id="2"/>
+            <w:bookmarkEnd w:id="3"/>
           </w:p>
         </w:tc>
         <w:tc>
@@ -1543,7 +1545,7 @@
                 <w:lang w:val="es-ES" w:eastAsia="es-ES"/>
               </w:rPr>
             </w:pPr>
-            <w:bookmarkStart w:id="3" w:name="INSTITUCION"/>
+            <w:bookmarkStart w:id="4" w:name="INSTITUCION"/>
             <w:r>
               <w:rPr>
                 <w:rFonts w:ascii="Arial" w:eastAsia="Times New Roman" w:hAnsi="Arial" w:cs="Arial"/>
@@ -1554,7 +1556,7 @@
               </w:rPr>
               <w:t>INSTITUCION</w:t>
             </w:r>
-            <w:bookmarkEnd w:id="3"/>
+            <w:bookmarkEnd w:id="4"/>
           </w:p>
         </w:tc>
         <w:tc>
@@ -4194,8 +4196,6 @@
           <w:lang w:val="es-ES"/>
         </w:rPr>
       </w:pPr>
-      <w:bookmarkStart w:id="4" w:name="_GoBack"/>
-      <w:bookmarkEnd w:id="4"/>
     </w:p>
     <w:p>
       <w:pPr>
@@ -4637,7 +4637,7 @@
             </wp:anchor>
           </w:drawing>
         </mc:Choice>
-        <mc:Fallback xmlns:cx1="http://schemas.microsoft.com/office/drawing/2015/9/8/chartex" xmlns:cx2="http://schemas.microsoft.com/office/drawing/2015/10/21/chartex" xmlns:cx3="http://schemas.microsoft.com/office/drawing/2016/5/9/chartex" xmlns:cx4="http://schemas.microsoft.com/office/drawing/2016/5/10/chartex" xmlns:cx5="http://schemas.microsoft.com/office/drawing/2016/5/11/chartex" xmlns:cx6="http://schemas.microsoft.com/office/drawing/2016/5/12/chartex" xmlns:cx7="http://schemas.microsoft.com/office/drawing/2016/5/13/chartex" xmlns:cx8="http://schemas.microsoft.com/office/drawing/2016/5/14/chartex" xmlns:aink="http://schemas.microsoft.com/office/drawing/2016/ink" xmlns:am3d="http://schemas.microsoft.com/office/drawing/2017/model3d" xmlns:oel="http://schemas.microsoft.com/office/2019/extlst" xmlns:w16cex="http://schemas.microsoft.com/office/word/2018/wordml/cex" xmlns:w16cid="http://schemas.microsoft.com/office/word/2016/wordml/cid" xmlns:w16="http://schemas.microsoft.com/office/word/2018/wordml" xmlns:w16du="http://schemas.microsoft.com/office/word/2023/wordml/word16du" xmlns:w16sdtdh="http://schemas.microsoft.com/office/word/2020/wordml/sdtdatahash" xmlns:w16sdtfl="http://schemas.microsoft.com/office/word/2024/wordml/sdtformatlock">
+        <mc:Fallback xmlns:w16sdtfl="http://schemas.microsoft.com/office/word/2024/wordml/sdtformatlock" xmlns:w16sdtdh="http://schemas.microsoft.com/office/word/2020/wordml/sdtdatahash" xmlns:w16du="http://schemas.microsoft.com/office/word/2023/wordml/word16du" xmlns:w16="http://schemas.microsoft.com/office/word/2018/wordml" xmlns:w16cid="http://schemas.microsoft.com/office/word/2016/wordml/cid" xmlns:w16cex="http://schemas.microsoft.com/office/word/2018/wordml/cex" xmlns:oel="http://schemas.microsoft.com/office/2019/extlst" xmlns:am3d="http://schemas.microsoft.com/office/drawing/2017/model3d" xmlns:aink="http://schemas.microsoft.com/office/drawing/2016/ink" xmlns:cx8="http://schemas.microsoft.com/office/drawing/2016/5/14/chartex" xmlns:cx7="http://schemas.microsoft.com/office/drawing/2016/5/13/chartex" xmlns:cx6="http://schemas.microsoft.com/office/drawing/2016/5/12/chartex" xmlns:cx5="http://schemas.microsoft.com/office/drawing/2016/5/11/chartex" xmlns:cx4="http://schemas.microsoft.com/office/drawing/2016/5/10/chartex" xmlns:cx3="http://schemas.microsoft.com/office/drawing/2016/5/9/chartex" xmlns:cx2="http://schemas.microsoft.com/office/drawing/2015/10/21/chartex" xmlns:cx1="http://schemas.microsoft.com/office/drawing/2015/9/8/chartex">
           <w:pict>
             <v:shapetype w14:anchorId="066252C6" id="_x0000_t202" coordsize="21600,21600" o:spt="202" path="m,l,21600r21600,l21600,xe">
               <v:stroke joinstyle="miter"/>
@@ -9797,7 +9797,7 @@
 </file>
 
 <file path=customXml/itemProps1.xml><?xml version="1.0" encoding="utf-8"?>
-<ds:datastoreItem xmlns:ds="http://schemas.openxmlformats.org/officeDocument/2006/customXml" ds:itemID="{93B4A613-D3CC-4B0D-8101-E81D830BBCD0}">
+<ds:datastoreItem xmlns:ds="http://schemas.openxmlformats.org/officeDocument/2006/customXml" ds:itemID="{6DBAA293-BCEA-43B0-B569-71DE9ACD6BF9}">
   <ds:schemaRefs>
     <ds:schemaRef ds:uri="http://schemas.openxmlformats.org/officeDocument/2006/bibliography"/>
   </ds:schemaRefs>

</xml_diff>

<commit_message>
feat: actualizacion completa para continuar en otra maquina
</commit_message>
<xml_diff>
--- a/plantillas/plantilla_informe.docx
+++ b/plantillas/plantilla_informe.docx
@@ -497,7 +497,7 @@
       </w:tr>
       <w:tr>
         <w:trPr>
-          <w:trHeight w:val="472"/>
+          <w:trHeight w:val="1170"/>
         </w:trPr>
         <w:tc>
           <w:tcPr>
@@ -609,6 +609,8 @@
               </w:rPr>
               <w:t>_INFORME_SUCCOR }}</w:t>
             </w:r>
+            <w:bookmarkStart w:id="0" w:name="_GoBack"/>
+            <w:bookmarkEnd w:id="0"/>
           </w:p>
           <w:p>
             <w:pPr>
@@ -1174,7 +1176,7 @@
         </w:rPr>
         <w:t xml:space="preserve">Mediante el </w:t>
       </w:r>
-      <w:bookmarkStart w:id="0" w:name="NOMBRE_INFORME_SUCOR"/>
+      <w:bookmarkStart w:id="1" w:name="NOMBRE_INFORME_SUCOR"/>
       <w:r>
         <w:rPr>
           <w:sz w:val="22"/>
@@ -1210,7 +1212,7 @@
         </w:rPr>
         <w:t>-2026-MINEDU/VMGI-PRONABEC-DICONCI-SUCCOR-LIMA</w:t>
       </w:r>
-      <w:bookmarkEnd w:id="0"/>
+      <w:bookmarkEnd w:id="1"/>
       <w:r>
         <w:rPr>
           <w:sz w:val="22"/>
@@ -1218,7 +1220,7 @@
         </w:rPr>
         <w:t xml:space="preserve">, la </w:t>
       </w:r>
-      <w:bookmarkStart w:id="1" w:name="_Hlk235083279"/>
+      <w:bookmarkStart w:id="2" w:name="_Hlk235083279"/>
       <w:r>
         <w:rPr>
           <w:sz w:val="22"/>
@@ -1226,7 +1228,7 @@
         </w:rPr>
         <w:t>Subdirección de Coordinación y Cooperación Regional Lima</w:t>
       </w:r>
-      <w:bookmarkEnd w:id="1"/>
+      <w:bookmarkEnd w:id="2"/>
       <w:r>
         <w:rPr>
           <w:sz w:val="22"/>
@@ -1445,7 +1447,7 @@
                 <w:lang w:val="es-ES" w:eastAsia="es-ES"/>
               </w:rPr>
             </w:pPr>
-            <w:bookmarkStart w:id="2" w:name="SEXO_LABEL_TABLA"/>
+            <w:bookmarkStart w:id="3" w:name="SEXO_LABEL_TABLA"/>
             <w:r>
               <w:rPr>
                 <w:rFonts w:ascii="Arial" w:eastAsia="Times New Roman" w:hAnsi="Arial" w:cs="Arial"/>
@@ -1456,7 +1458,7 @@
               </w:rPr>
               <w:t>BECARIO/A</w:t>
             </w:r>
-            <w:bookmarkEnd w:id="2"/>
+            <w:bookmarkEnd w:id="3"/>
           </w:p>
         </w:tc>
         <w:tc>
@@ -1543,7 +1545,7 @@
                 <w:lang w:val="es-ES" w:eastAsia="es-ES"/>
               </w:rPr>
             </w:pPr>
-            <w:bookmarkStart w:id="3" w:name="INSTITUCION"/>
+            <w:bookmarkStart w:id="4" w:name="INSTITUCION"/>
             <w:r>
               <w:rPr>
                 <w:rFonts w:ascii="Arial" w:eastAsia="Times New Roman" w:hAnsi="Arial" w:cs="Arial"/>
@@ -1554,7 +1556,7 @@
               </w:rPr>
               <w:t>INSTITUCION</w:t>
             </w:r>
-            <w:bookmarkEnd w:id="3"/>
+            <w:bookmarkEnd w:id="4"/>
           </w:p>
         </w:tc>
         <w:tc>
@@ -4194,8 +4196,6 @@
           <w:lang w:val="es-ES"/>
         </w:rPr>
       </w:pPr>
-      <w:bookmarkStart w:id="4" w:name="_GoBack"/>
-      <w:bookmarkEnd w:id="4"/>
     </w:p>
     <w:p>
       <w:pPr>
@@ -4637,7 +4637,7 @@
             </wp:anchor>
           </w:drawing>
         </mc:Choice>
-        <mc:Fallback xmlns:cx1="http://schemas.microsoft.com/office/drawing/2015/9/8/chartex" xmlns:cx2="http://schemas.microsoft.com/office/drawing/2015/10/21/chartex" xmlns:cx3="http://schemas.microsoft.com/office/drawing/2016/5/9/chartex" xmlns:cx4="http://schemas.microsoft.com/office/drawing/2016/5/10/chartex" xmlns:cx5="http://schemas.microsoft.com/office/drawing/2016/5/11/chartex" xmlns:cx6="http://schemas.microsoft.com/office/drawing/2016/5/12/chartex" xmlns:cx7="http://schemas.microsoft.com/office/drawing/2016/5/13/chartex" xmlns:cx8="http://schemas.microsoft.com/office/drawing/2016/5/14/chartex" xmlns:aink="http://schemas.microsoft.com/office/drawing/2016/ink" xmlns:am3d="http://schemas.microsoft.com/office/drawing/2017/model3d" xmlns:oel="http://schemas.microsoft.com/office/2019/extlst" xmlns:w16cex="http://schemas.microsoft.com/office/word/2018/wordml/cex" xmlns:w16cid="http://schemas.microsoft.com/office/word/2016/wordml/cid" xmlns:w16="http://schemas.microsoft.com/office/word/2018/wordml" xmlns:w16du="http://schemas.microsoft.com/office/word/2023/wordml/word16du" xmlns:w16sdtdh="http://schemas.microsoft.com/office/word/2020/wordml/sdtdatahash" xmlns:w16sdtfl="http://schemas.microsoft.com/office/word/2024/wordml/sdtformatlock">
+        <mc:Fallback xmlns:w16sdtfl="http://schemas.microsoft.com/office/word/2024/wordml/sdtformatlock" xmlns:w16sdtdh="http://schemas.microsoft.com/office/word/2020/wordml/sdtdatahash" xmlns:w16du="http://schemas.microsoft.com/office/word/2023/wordml/word16du" xmlns:w16="http://schemas.microsoft.com/office/word/2018/wordml" xmlns:w16cid="http://schemas.microsoft.com/office/word/2016/wordml/cid" xmlns:w16cex="http://schemas.microsoft.com/office/word/2018/wordml/cex" xmlns:oel="http://schemas.microsoft.com/office/2019/extlst" xmlns:am3d="http://schemas.microsoft.com/office/drawing/2017/model3d" xmlns:aink="http://schemas.microsoft.com/office/drawing/2016/ink" xmlns:cx8="http://schemas.microsoft.com/office/drawing/2016/5/14/chartex" xmlns:cx7="http://schemas.microsoft.com/office/drawing/2016/5/13/chartex" xmlns:cx6="http://schemas.microsoft.com/office/drawing/2016/5/12/chartex" xmlns:cx5="http://schemas.microsoft.com/office/drawing/2016/5/11/chartex" xmlns:cx4="http://schemas.microsoft.com/office/drawing/2016/5/10/chartex" xmlns:cx3="http://schemas.microsoft.com/office/drawing/2016/5/9/chartex" xmlns:cx2="http://schemas.microsoft.com/office/drawing/2015/10/21/chartex" xmlns:cx1="http://schemas.microsoft.com/office/drawing/2015/9/8/chartex">
           <w:pict>
             <v:shapetype w14:anchorId="066252C6" id="_x0000_t202" coordsize="21600,21600" o:spt="202" path="m,l,21600r21600,l21600,xe">
               <v:stroke joinstyle="miter"/>
@@ -9797,7 +9797,7 @@
 </file>
 
 <file path=customXml/itemProps1.xml><?xml version="1.0" encoding="utf-8"?>
-<ds:datastoreItem xmlns:ds="http://schemas.openxmlformats.org/officeDocument/2006/customXml" ds:itemID="{93B4A613-D3CC-4B0D-8101-E81D830BBCD0}">
+<ds:datastoreItem xmlns:ds="http://schemas.openxmlformats.org/officeDocument/2006/customXml" ds:itemID="{6DBAA293-BCEA-43B0-B569-71DE9ACD6BF9}">
   <ds:schemaRefs>
     <ds:schemaRef ds:uri="http://schemas.openxmlformats.org/officeDocument/2006/bibliography"/>
   </ds:schemaRefs>

</xml_diff>

<commit_message>
feat: soporte de formatos consolidados, alerta de electivos en individual, rediseño de interfaz y actualizacion de plantillas
</commit_message>
<xml_diff>
--- a/plantillas/plantilla_informe.docx
+++ b/plantillas/plantilla_informe.docx
@@ -609,8 +609,6 @@
               </w:rPr>
               <w:t>_INFORME_SUCCOR }}</w:t>
             </w:r>
-            <w:bookmarkStart w:id="0" w:name="_GoBack"/>
-            <w:bookmarkEnd w:id="0"/>
           </w:p>
           <w:p>
             <w:pPr>
@@ -1176,41 +1174,45 @@
         </w:rPr>
         <w:t xml:space="preserve">Mediante el </w:t>
       </w:r>
-      <w:bookmarkStart w:id="1" w:name="NOMBRE_INFORME_SUCOR"/>
-      <w:r>
-        <w:rPr>
-          <w:sz w:val="22"/>
-          <w:szCs w:val="22"/>
-        </w:rPr>
-        <w:t xml:space="preserve">Informe N° </w:t>
-      </w:r>
-      <w:r>
-        <w:rPr>
-          <w:sz w:val="22"/>
-          <w:szCs w:val="22"/>
-        </w:rPr>
-        <w:t>4</w:t>
-      </w:r>
-      <w:r>
-        <w:rPr>
-          <w:sz w:val="22"/>
-          <w:szCs w:val="22"/>
-        </w:rPr>
-        <w:t>1</w:t>
-      </w:r>
-      <w:r>
-        <w:rPr>
-          <w:sz w:val="22"/>
-          <w:szCs w:val="22"/>
-        </w:rPr>
-        <w:t>87</w:t>
-      </w:r>
-      <w:r>
-        <w:rPr>
-          <w:sz w:val="22"/>
-          <w:szCs w:val="22"/>
-        </w:rPr>
-        <w:t>-2026-MINEDU/VMGI-PRONABEC-DICONCI-SUCCOR-LIMA</w:t>
+      <w:bookmarkStart w:id="0" w:name="NOMBRE_INFORME_SUCOR"/>
+      <w:proofErr w:type="gramStart"/>
+      <w:r>
+        <w:rPr>
+          <w:sz w:val="22"/>
+          <w:szCs w:val="22"/>
+        </w:rPr>
+        <w:t>{{ NOMBRE</w:t>
+      </w:r>
+      <w:proofErr w:type="gramEnd"/>
+      <w:r>
+        <w:rPr>
+          <w:sz w:val="22"/>
+          <w:szCs w:val="22"/>
+        </w:rPr>
+        <w:t>_INFORME_SUCCOR }}</w:t>
+      </w:r>
+      <w:bookmarkEnd w:id="0"/>
+      <w:r>
+        <w:rPr>
+          <w:sz w:val="22"/>
+          <w:szCs w:val="22"/>
+        </w:rPr>
+        <w:t xml:space="preserve">, la </w:t>
+      </w:r>
+      <w:bookmarkStart w:id="1" w:name="_Hlk235083279"/>
+      <w:r>
+        <w:rPr>
+          <w:sz w:val="22"/>
+          <w:szCs w:val="22"/>
+        </w:rPr>
+        <w:t>Subdirección de Coordinación</w:t>
+      </w:r>
+      <w:r>
+        <w:rPr>
+          <w:sz w:val="22"/>
+          <w:szCs w:val="22"/>
+        </w:rPr>
+        <w:t xml:space="preserve"> y Cooperación Regional Lima</w:t>
       </w:r>
       <w:bookmarkEnd w:id="1"/>
       <w:r>
@@ -1218,23 +1220,14 @@
           <w:sz w:val="22"/>
           <w:szCs w:val="22"/>
         </w:rPr>
-        <w:t xml:space="preserve">, la </w:t>
-      </w:r>
-      <w:bookmarkStart w:id="2" w:name="_Hlk235083279"/>
-      <w:r>
-        <w:rPr>
-          <w:sz w:val="22"/>
-          <w:szCs w:val="22"/>
-        </w:rPr>
-        <w:t>Subdirección de Coordinación y Cooperación Regional Lima</w:t>
-      </w:r>
-      <w:bookmarkEnd w:id="2"/>
-      <w:r>
-        <w:rPr>
-          <w:sz w:val="22"/>
-          <w:szCs w:val="22"/>
-        </w:rPr>
-        <w:t xml:space="preserve">, </w:t>
+        <w:t xml:space="preserve">, traslada la </w:t>
+      </w:r>
+      <w:r>
+        <w:rPr>
+          <w:sz w:val="22"/>
+          <w:szCs w:val="22"/>
+        </w:rPr>
+        <w:t xml:space="preserve">solicitud de ampliación </w:t>
       </w:r>
       <w:r>
         <w:rPr>
@@ -1242,14 +1235,7 @@
           <w:szCs w:val="22"/>
         </w:rPr>
         <w:lastRenderedPageBreak/>
-        <w:t xml:space="preserve">traslada la </w:t>
-      </w:r>
-      <w:r>
-        <w:rPr>
-          <w:sz w:val="22"/>
-          <w:szCs w:val="22"/>
-        </w:rPr>
-        <w:t xml:space="preserve">solicitud de ampliación excepcional de la duración del periodo de estudios </w:t>
+        <w:t xml:space="preserve">excepcional de la duración del periodo de estudios </w:t>
       </w:r>
       <w:r>
         <w:rPr>
@@ -1447,7 +1433,7 @@
                 <w:lang w:val="es-ES" w:eastAsia="es-ES"/>
               </w:rPr>
             </w:pPr>
-            <w:bookmarkStart w:id="3" w:name="SEXO_LABEL_TABLA"/>
+            <w:bookmarkStart w:id="2" w:name="SEXO_LABEL_TABLA"/>
             <w:r>
               <w:rPr>
                 <w:rFonts w:ascii="Arial" w:eastAsia="Times New Roman" w:hAnsi="Arial" w:cs="Arial"/>
@@ -1458,7 +1444,7 @@
               </w:rPr>
               <w:t>BECARIO/A</w:t>
             </w:r>
-            <w:bookmarkEnd w:id="3"/>
+            <w:bookmarkEnd w:id="2"/>
           </w:p>
         </w:tc>
         <w:tc>
@@ -1545,7 +1531,7 @@
                 <w:lang w:val="es-ES" w:eastAsia="es-ES"/>
               </w:rPr>
             </w:pPr>
-            <w:bookmarkStart w:id="4" w:name="INSTITUCION"/>
+            <w:bookmarkStart w:id="3" w:name="INSTITUCION"/>
             <w:r>
               <w:rPr>
                 <w:rFonts w:ascii="Arial" w:eastAsia="Times New Roman" w:hAnsi="Arial" w:cs="Arial"/>
@@ -1556,7 +1542,7 @@
               </w:rPr>
               <w:t>INSTITUCION</w:t>
             </w:r>
-            <w:bookmarkEnd w:id="4"/>
+            <w:bookmarkEnd w:id="3"/>
           </w:p>
         </w:tc>
         <w:tc>
@@ -2329,7 +2315,7 @@
           <w:sz w:val="22"/>
           <w:szCs w:val="22"/>
         </w:rPr>
-        <w:t xml:space="preserve">La DIBEC, a través de la SUS, evalúa cada caso y emite el informe correspondiente. El resultado de dicha evaluación es comunicado al </w:t>
+        <w:t xml:space="preserve">La DIBEC, a través de la SUS, evalúa cada caso y emite el informe correspondiente. El resultado de dicha evaluación es comunicado al solicitante mediante oficio emitido por la DIBEC, la cual tramita ante la OAGD </w:t>
       </w:r>
       <w:r>
         <w:rPr>
@@ -2339,7 +2325,7 @@
           <w:szCs w:val="22"/>
         </w:rPr>
         <w:lastRenderedPageBreak/>
-        <w:t>solicitante mediante oficio emitido por la DIBEC, la cual tramita ante la OAGD la notificación correspondiente, con copia a la SUCCOR para su conocimiento. Cuando la evaluación resulte favorable, la comunicación también se remite a la OAF para los fines correspondientes</w:t>
+        <w:t>la notificación correspondiente, con copia a la SUCCOR para su conocimiento. Cuando la evaluación resulte favorable, la comunicación también se remite a la OAF para los fines correspondientes</w:t>
       </w:r>
       <w:r>
         <w:rPr>
@@ -2677,23 +2663,143 @@
           <w:sz w:val="22"/>
           <w:szCs w:val="22"/>
         </w:rPr>
-        <w:t xml:space="preserve">La solicitud </w:t>
-      </w:r>
-      <w:proofErr w:type="gramStart"/>
-      <w:r>
-        <w:rPr>
-          <w:sz w:val="22"/>
-          <w:szCs w:val="22"/>
-        </w:rPr>
-        <w:t>{{ DEL</w:t>
-      </w:r>
-      <w:proofErr w:type="gramEnd"/>
-      <w:r>
-        <w:rPr>
-          <w:sz w:val="22"/>
-          <w:szCs w:val="22"/>
-        </w:rPr>
-        <w:t>_BECARIO_A }} fue ingresada por mesa de partes el {{ FECHA_SOLICITUD_TEXTO }}, por lo tanto, de acuerdo al plazo de presentación de la ampliación, se verifica que fue presentado antes de la matrícula e inicio del periodo académico a ampliar.</w:t>
+        <w:t xml:space="preserve">La norma técnica </w:t>
+      </w:r>
+      <w:r>
+        <w:rPr>
+          <w:sz w:val="22"/>
+          <w:szCs w:val="22"/>
+        </w:rPr>
+        <w:t>denominada “Disposiciones para el becario del PRONABEC”</w:t>
+      </w:r>
+      <w:r>
+        <w:rPr>
+          <w:sz w:val="22"/>
+          <w:szCs w:val="22"/>
+        </w:rPr>
+        <w:t xml:space="preserve"> versión 02, </w:t>
+      </w:r>
+      <w:r>
+        <w:rPr>
+          <w:sz w:val="22"/>
+          <w:szCs w:val="22"/>
+        </w:rPr>
+        <w:t xml:space="preserve">establece para </w:t>
+      </w:r>
+      <w:r>
+        <w:rPr>
+          <w:sz w:val="22"/>
+          <w:szCs w:val="22"/>
+        </w:rPr>
+        <w:t xml:space="preserve">el otorgamiento de </w:t>
+      </w:r>
+      <w:r>
+        <w:rPr>
+          <w:sz w:val="22"/>
+          <w:szCs w:val="22"/>
+        </w:rPr>
+        <w:t>la ampliación excepcional de la duración del periodo de estudios</w:t>
+      </w:r>
+      <w:r>
+        <w:rPr>
+          <w:sz w:val="22"/>
+          <w:szCs w:val="22"/>
+        </w:rPr>
+        <w:t>, lo siguiente:</w:t>
+      </w:r>
+      <w:r>
+        <w:rPr>
+          <w:sz w:val="22"/>
+          <w:szCs w:val="22"/>
+        </w:rPr>
+        <w:t xml:space="preserve"> </w:t>
+      </w:r>
+      <w:r>
+        <w:rPr>
+          <w:i/>
+          <w:sz w:val="22"/>
+          <w:szCs w:val="22"/>
+        </w:rPr>
+        <w:t xml:space="preserve">“el becario presenta la solicitud de ampliación excepcional de un (1) periodo de estudios, por </w:t>
+      </w:r>
+      <w:r>
+        <w:rPr>
+          <w:i/>
+          <w:sz w:val="22"/>
+          <w:szCs w:val="22"/>
+        </w:rPr>
+        <w:t>M</w:t>
+      </w:r>
+      <w:r>
+        <w:rPr>
+          <w:i/>
+          <w:sz w:val="22"/>
+          <w:szCs w:val="22"/>
+        </w:rPr>
+        <w:t xml:space="preserve">esa de </w:t>
+      </w:r>
+      <w:r>
+        <w:rPr>
+          <w:i/>
+          <w:sz w:val="22"/>
+          <w:szCs w:val="22"/>
+        </w:rPr>
+        <w:t>P</w:t>
+      </w:r>
+      <w:r>
+        <w:rPr>
+          <w:i/>
+          <w:sz w:val="22"/>
+          <w:szCs w:val="22"/>
+        </w:rPr>
+        <w:t>artes del PRONABEC al culminar su último periodo programado en el SIBEC</w:t>
+      </w:r>
+      <w:r>
+        <w:rPr>
+          <w:i/>
+          <w:sz w:val="22"/>
+          <w:szCs w:val="22"/>
+        </w:rPr>
+        <w:t xml:space="preserve"> y antes de la matricula e inicio del periodo académico a ampliar</w:t>
+      </w:r>
+      <w:r>
+        <w:rPr>
+          <w:i/>
+          <w:sz w:val="22"/>
+          <w:szCs w:val="22"/>
+        </w:rPr>
+        <w:t xml:space="preserve">, adjuntando la documentación que acredite que aún no ha culminado </w:t>
+      </w:r>
+      <w:r>
+        <w:rPr>
+          <w:i/>
+          <w:sz w:val="22"/>
+          <w:szCs w:val="22"/>
+        </w:rPr>
+        <w:t>la carrera o programa de</w:t>
+      </w:r>
+      <w:r>
+        <w:rPr>
+          <w:i/>
+          <w:sz w:val="22"/>
+          <w:szCs w:val="22"/>
+        </w:rPr>
+        <w:t xml:space="preserve"> estudios y que precise los cursos pendientes que tiene el becario”</w:t>
+      </w:r>
+      <w:r>
+        <w:rPr>
+          <w:i/>
+          <w:sz w:val="22"/>
+          <w:szCs w:val="22"/>
+        </w:rPr>
+        <w:t>.</w:t>
+      </w:r>
+      <w:r>
+        <w:rPr>
+          <w:sz w:val="22"/>
+          <w:szCs w:val="22"/>
+        </w:rPr>
+        <w:t xml:space="preserve"> </w:t>
       </w:r>
     </w:p>
     <w:p>
@@ -2717,125 +2823,295 @@
         <w:ind w:left="567"/>
         <w:jc w:val="both"/>
         <w:rPr>
-          <w:i/>
-          <w:sz w:val="22"/>
-          <w:szCs w:val="22"/>
-        </w:rPr>
-      </w:pPr>
-      <w:r>
-        <w:rPr>
-          <w:sz w:val="22"/>
-          <w:szCs w:val="22"/>
-        </w:rPr>
-        <w:t xml:space="preserve">Mediante </w:t>
-      </w:r>
-      <w:proofErr w:type="gramStart"/>
-      <w:r>
-        <w:rPr>
-          <w:sz w:val="22"/>
-          <w:szCs w:val="22"/>
-        </w:rPr>
-        <w:t>{{ CODIGO</w:t>
-      </w:r>
-      <w:proofErr w:type="gramEnd"/>
-      <w:r>
-        <w:rPr>
-          <w:sz w:val="22"/>
-          <w:szCs w:val="22"/>
-        </w:rPr>
-        <w:t xml:space="preserve">_DOC_IES }}, de fecha {{ FECHA_DOC_IES_TEXTO }}, la {{ INSTITUCION }} remite la relación de cursos que tiene pendiente {{ EL_LA_BECARIO_A }} {{ NOMBRE_PRIMERO_NOMBRES }} al finalizar el semestre {{ SEMESTRE_ANTERIOR }}. De la revisión de dicho documento se observa que </w:t>
-      </w:r>
-      <w:proofErr w:type="gramStart"/>
-      <w:r>
-        <w:rPr>
-          <w:sz w:val="22"/>
-          <w:szCs w:val="22"/>
-        </w:rPr>
-        <w:t>{{ EL</w:t>
-      </w:r>
-      <w:proofErr w:type="gramEnd"/>
-      <w:r>
-        <w:rPr>
-          <w:sz w:val="22"/>
-          <w:szCs w:val="22"/>
-        </w:rPr>
-        <w:t>_LA_BECARIO_A }} tiene cursos pendientes, los cuales acreditan que aún no ha culminado sus estudios y que dichos cursos pueden cursarse en un periodo académico adicional, en este caso, en el semestre {{ SEMESTRE_SOLICITADO }}.</w:t>
-      </w:r>
-    </w:p>
-    <w:p>
-      <w:pPr>
-        <w:pStyle w:val="Prrafodelista"/>
-        <w:spacing w:after="0"/>
+          <w:sz w:val="22"/>
+          <w:szCs w:val="22"/>
+        </w:rPr>
+      </w:pPr>
+      <w:r>
+        <w:rPr>
+          <w:sz w:val="22"/>
+          <w:szCs w:val="22"/>
+        </w:rPr>
+        <w:t xml:space="preserve">Por lo </w:t>
+      </w:r>
+      <w:r>
+        <w:rPr>
+          <w:sz w:val="22"/>
+          <w:szCs w:val="22"/>
+        </w:rPr>
+        <w:t>tanto, se deslinda que la</w:t>
+      </w:r>
+      <w:r>
+        <w:rPr>
+          <w:sz w:val="22"/>
+          <w:szCs w:val="22"/>
+        </w:rPr>
+        <w:t xml:space="preserve"> citada norma </w:t>
+      </w:r>
+      <w:r>
+        <w:rPr>
+          <w:sz w:val="22"/>
+          <w:szCs w:val="22"/>
+        </w:rPr>
+        <w:t>precisa</w:t>
+      </w:r>
+      <w:r>
+        <w:rPr>
+          <w:sz w:val="22"/>
+          <w:szCs w:val="22"/>
+        </w:rPr>
+        <w:t xml:space="preserve"> </w:t>
+      </w:r>
+      <w:r>
+        <w:rPr>
+          <w:sz w:val="22"/>
+          <w:szCs w:val="22"/>
+        </w:rPr>
+        <w:t>3</w:t>
+      </w:r>
+      <w:r>
+        <w:rPr>
+          <w:sz w:val="22"/>
+          <w:szCs w:val="22"/>
+        </w:rPr>
+        <w:t xml:space="preserve"> </w:t>
+      </w:r>
+      <w:r>
+        <w:rPr>
+          <w:sz w:val="22"/>
+          <w:szCs w:val="22"/>
+        </w:rPr>
+        <w:t xml:space="preserve">puntos a tomar en cuenta para la evaluación de la </w:t>
+      </w:r>
+      <w:r>
+        <w:rPr>
+          <w:sz w:val="22"/>
+          <w:szCs w:val="22"/>
+        </w:rPr>
+        <w:t xml:space="preserve">ampliación excepcional de la duración del periodo de estudios: </w:t>
+      </w:r>
+    </w:p>
+    <w:p>
+      <w:pPr>
+        <w:pStyle w:val="Default"/>
+        <w:jc w:val="both"/>
+        <w:rPr>
+          <w:sz w:val="22"/>
+          <w:szCs w:val="22"/>
+        </w:rPr>
+      </w:pPr>
+    </w:p>
+    <w:p>
+      <w:pPr>
+        <w:pStyle w:val="Default"/>
+        <w:numPr>
+          <w:ilvl w:val="0"/>
+          <w:numId w:val="36"/>
+        </w:numPr>
+        <w:jc w:val="both"/>
+        <w:rPr>
+          <w:sz w:val="22"/>
+          <w:szCs w:val="22"/>
+        </w:rPr>
+      </w:pPr>
+      <w:r>
+        <w:rPr>
+          <w:sz w:val="22"/>
+          <w:szCs w:val="22"/>
+        </w:rPr>
+        <w:t>E</w:t>
+      </w:r>
+      <w:r>
+        <w:rPr>
+          <w:sz w:val="22"/>
+          <w:szCs w:val="22"/>
+        </w:rPr>
+        <w:t>l plazo de presentación</w:t>
+      </w:r>
+      <w:r>
+        <w:rPr>
+          <w:sz w:val="22"/>
+          <w:szCs w:val="22"/>
+        </w:rPr>
+        <w:t>.</w:t>
+      </w:r>
+    </w:p>
+    <w:p>
+      <w:pPr>
+        <w:pStyle w:val="Default"/>
+        <w:numPr>
+          <w:ilvl w:val="0"/>
+          <w:numId w:val="36"/>
+        </w:numPr>
+        <w:jc w:val="both"/>
+        <w:rPr>
+          <w:sz w:val="22"/>
+          <w:szCs w:val="22"/>
+        </w:rPr>
+      </w:pPr>
+      <w:r>
+        <w:rPr>
+          <w:sz w:val="22"/>
+          <w:szCs w:val="22"/>
+        </w:rPr>
+        <w:t>L</w:t>
+      </w:r>
+      <w:r>
+        <w:rPr>
+          <w:sz w:val="22"/>
+          <w:szCs w:val="22"/>
+        </w:rPr>
+        <w:t>os</w:t>
+      </w:r>
+      <w:r>
+        <w:rPr>
+          <w:sz w:val="22"/>
+          <w:szCs w:val="22"/>
+        </w:rPr>
+        <w:t xml:space="preserve"> </w:t>
+      </w:r>
+      <w:r>
+        <w:rPr>
+          <w:sz w:val="22"/>
+          <w:szCs w:val="22"/>
+        </w:rPr>
+        <w:t xml:space="preserve">documentos académicos a presentar para acreditar </w:t>
+      </w:r>
+      <w:r>
+        <w:rPr>
+          <w:sz w:val="22"/>
+          <w:szCs w:val="22"/>
+        </w:rPr>
+        <w:t xml:space="preserve">que </w:t>
+      </w:r>
+      <w:r>
+        <w:rPr>
+          <w:sz w:val="22"/>
+          <w:szCs w:val="22"/>
+        </w:rPr>
+        <w:t>aún no se ha culminado la carrera</w:t>
+      </w:r>
+      <w:r>
+        <w:rPr>
+          <w:sz w:val="22"/>
+          <w:szCs w:val="22"/>
+        </w:rPr>
+        <w:t xml:space="preserve"> (con</w:t>
+      </w:r>
+      <w:r>
+        <w:rPr>
+          <w:sz w:val="22"/>
+          <w:szCs w:val="22"/>
+        </w:rPr>
+        <w:t xml:space="preserve"> los cursos pendientes que tiene el becario</w:t>
+      </w:r>
+      <w:r>
+        <w:rPr>
+          <w:sz w:val="22"/>
+          <w:szCs w:val="22"/>
+        </w:rPr>
+        <w:t>).</w:t>
+      </w:r>
+    </w:p>
+    <w:p>
+      <w:pPr>
+        <w:pStyle w:val="Default"/>
+        <w:numPr>
+          <w:ilvl w:val="0"/>
+          <w:numId w:val="36"/>
+        </w:numPr>
+        <w:jc w:val="both"/>
+        <w:rPr>
+          <w:sz w:val="22"/>
+          <w:szCs w:val="22"/>
+        </w:rPr>
+      </w:pPr>
+      <w:r>
+        <w:rPr>
+          <w:sz w:val="22"/>
+          <w:szCs w:val="22"/>
+        </w:rPr>
+        <w:t>L</w:t>
+      </w:r>
+      <w:r>
+        <w:rPr>
+          <w:sz w:val="22"/>
+          <w:szCs w:val="22"/>
+        </w:rPr>
+        <w:t>os curso</w:t>
+      </w:r>
+      <w:r>
+        <w:rPr>
+          <w:sz w:val="22"/>
+          <w:szCs w:val="22"/>
+        </w:rPr>
+        <w:t>s</w:t>
+      </w:r>
+      <w:r>
+        <w:rPr>
+          <w:sz w:val="22"/>
+          <w:szCs w:val="22"/>
+        </w:rPr>
+        <w:t xml:space="preserve"> pendiente</w:t>
+      </w:r>
+      <w:r>
+        <w:rPr>
+          <w:sz w:val="22"/>
+          <w:szCs w:val="22"/>
+        </w:rPr>
+        <w:t xml:space="preserve">s </w:t>
+      </w:r>
+      <w:r>
+        <w:rPr>
+          <w:sz w:val="22"/>
+          <w:szCs w:val="22"/>
+        </w:rPr>
+        <w:t xml:space="preserve">deben ser suficientes para culminar la carrera o programa de estudios </w:t>
+      </w:r>
+      <w:r>
+        <w:rPr>
+          <w:sz w:val="22"/>
+          <w:szCs w:val="22"/>
+        </w:rPr>
+        <w:t xml:space="preserve">y </w:t>
+      </w:r>
+      <w:r>
+        <w:rPr>
+          <w:sz w:val="22"/>
+          <w:szCs w:val="22"/>
+        </w:rPr>
+        <w:t>deben efectuar</w:t>
+      </w:r>
+      <w:r>
+        <w:rPr>
+          <w:sz w:val="22"/>
+          <w:szCs w:val="22"/>
+        </w:rPr>
+        <w:t>se</w:t>
+      </w:r>
+      <w:r>
+        <w:rPr>
+          <w:sz w:val="22"/>
+          <w:szCs w:val="22"/>
+        </w:rPr>
+        <w:t xml:space="preserve"> en el periodo académico inmediato posterior al término del periodo de estudios programado</w:t>
+      </w:r>
+      <w:r>
+        <w:rPr>
+          <w:sz w:val="22"/>
+          <w:szCs w:val="22"/>
+        </w:rPr>
+        <w:t xml:space="preserve">. </w:t>
+      </w:r>
+    </w:p>
+    <w:p>
+      <w:pPr>
+        <w:pStyle w:val="Default"/>
         <w:ind w:left="567"/>
-        <w:rPr>
-          <w:rFonts w:ascii="Arial" w:hAnsi="Arial" w:cs="Arial"/>
-          <w:sz w:val="20"/>
-          <w:szCs w:val="20"/>
-        </w:rPr>
-      </w:pPr>
-    </w:p>
-    <w:p>
-      <w:pPr>
-        <w:pStyle w:val="Prrafodelista"/>
-        <w:spacing w:after="0"/>
-        <w:ind w:left="567"/>
-        <w:rPr>
-          <w:rFonts w:ascii="Arial" w:hAnsi="Arial" w:cs="Arial"/>
-          <w:u w:val="single"/>
-        </w:rPr>
-      </w:pPr>
-      <w:r>
-        <w:rPr>
-          <w:rFonts w:ascii="Arial" w:hAnsi="Arial" w:cs="Arial"/>
-          <w:u w:val="single"/>
-        </w:rPr>
-        <w:t xml:space="preserve">Listado de cursos pendientes que tiene </w:t>
-      </w:r>
-      <w:proofErr w:type="gramStart"/>
-      <w:r>
-        <w:rPr>
-          <w:rFonts w:ascii="Arial" w:hAnsi="Arial" w:cs="Arial"/>
-          <w:u w:val="single"/>
-        </w:rPr>
-        <w:t>{{ EL</w:t>
-      </w:r>
-      <w:proofErr w:type="gramEnd"/>
-      <w:r>
-        <w:rPr>
-          <w:rFonts w:ascii="Arial" w:hAnsi="Arial" w:cs="Arial"/>
-          <w:u w:val="single"/>
-        </w:rPr>
-        <w:t>_LA_BECARIO_A }}:</w:t>
-      </w:r>
-    </w:p>
-    <w:p>
-      <w:pPr>
-        <w:spacing w:after="0"/>
-        <w:ind w:firstLine="567"/>
-        <w:rPr>
-          <w:rFonts w:ascii="Arial" w:hAnsi="Arial" w:cs="Arial"/>
-        </w:rPr>
-      </w:pPr>
-      <w:proofErr w:type="gramStart"/>
-      <w:r>
-        <w:rPr>
-          <w:rFonts w:ascii="Arial" w:hAnsi="Arial" w:cs="Arial"/>
-        </w:rPr>
-        <w:t>{{ CURSOS</w:t>
-      </w:r>
-      <w:proofErr w:type="gramEnd"/>
-      <w:r>
-        <w:rPr>
-          <w:rFonts w:ascii="Arial" w:hAnsi="Arial" w:cs="Arial"/>
-        </w:rPr>
-        <w:t>_PENDIENTES }}</w:t>
-      </w:r>
-    </w:p>
-    <w:p>
-      <w:pPr>
-        <w:spacing w:after="0"/>
-        <w:rPr>
-          <w:rFonts w:ascii="Arial" w:hAnsi="Arial" w:cs="Arial"/>
+        <w:jc w:val="both"/>
+        <w:rPr>
+          <w:sz w:val="22"/>
+          <w:szCs w:val="22"/>
         </w:rPr>
       </w:pPr>
     </w:p>
@@ -2858,118 +3134,23 @@
           <w:sz w:val="22"/>
           <w:szCs w:val="22"/>
         </w:rPr>
-        <w:t xml:space="preserve">De acuerdo con el Sistema Integrado de Becas y Crédito Educativo (SIBEC), </w:t>
-      </w:r>
-      <w:proofErr w:type="gramStart"/>
-      <w:r>
-        <w:rPr>
-          <w:sz w:val="22"/>
-          <w:szCs w:val="22"/>
-        </w:rPr>
-        <w:t>{{ EL</w:t>
-      </w:r>
-      <w:proofErr w:type="gramEnd"/>
-      <w:r>
-        <w:rPr>
-          <w:sz w:val="22"/>
-          <w:szCs w:val="22"/>
-        </w:rPr>
-        <w:t>_LA_BECARIO_A }} tiene registrada la siguiente programación:</w:t>
-      </w:r>
-    </w:p>
-    <w:p>
-      <w:pPr>
-        <w:pStyle w:val="Default"/>
-        <w:ind w:left="567"/>
-        <w:jc w:val="both"/>
-        <w:rPr>
-          <w:sz w:val="22"/>
-          <w:szCs w:val="22"/>
-        </w:rPr>
-      </w:pPr>
-    </w:p>
-    <w:p>
-      <w:pPr>
-        <w:pStyle w:val="Default"/>
-        <w:ind w:left="567"/>
-        <w:jc w:val="both"/>
-        <w:rPr>
-          <w:sz w:val="22"/>
-          <w:szCs w:val="22"/>
-        </w:rPr>
-      </w:pPr>
-      <w:r>
-        <w:rPr>
-          <w:sz w:val="22"/>
-          <w:szCs w:val="22"/>
-        </w:rPr>
-        <w:t>Inicio</w:t>
-      </w:r>
-      <w:r>
-        <w:rPr>
-          <w:sz w:val="22"/>
-          <w:szCs w:val="22"/>
-        </w:rPr>
-        <w:tab/>
-        <w:t xml:space="preserve">: </w:t>
-      </w:r>
-      <w:proofErr w:type="gramStart"/>
-      <w:r>
-        <w:rPr>
-          <w:sz w:val="22"/>
-          <w:szCs w:val="22"/>
-        </w:rPr>
-        <w:t>{{ FECHA</w:t>
-      </w:r>
-      <w:proofErr w:type="gramEnd"/>
-      <w:r>
-        <w:rPr>
-          <w:sz w:val="22"/>
-          <w:szCs w:val="22"/>
-        </w:rPr>
-        <w:t>_INICIO_SIBEC }}</w:t>
-      </w:r>
-    </w:p>
-    <w:p>
-      <w:pPr>
-        <w:pStyle w:val="Default"/>
-        <w:ind w:left="567"/>
-        <w:jc w:val="both"/>
-        <w:rPr>
-          <w:sz w:val="22"/>
-          <w:szCs w:val="22"/>
-        </w:rPr>
-      </w:pPr>
-      <w:r>
-        <w:rPr>
-          <w:sz w:val="22"/>
-          <w:szCs w:val="22"/>
-        </w:rPr>
-        <w:t>Fin</w:t>
-      </w:r>
-      <w:r>
-        <w:rPr>
-          <w:sz w:val="22"/>
-          <w:szCs w:val="22"/>
-        </w:rPr>
-        <w:tab/>
-        <w:t xml:space="preserve">: </w:t>
-      </w:r>
-      <w:proofErr w:type="gramStart"/>
-      <w:r>
-        <w:rPr>
-          <w:sz w:val="22"/>
-          <w:szCs w:val="22"/>
-        </w:rPr>
-        <w:t>{{ FECHA</w:t>
-      </w:r>
-      <w:proofErr w:type="gramEnd"/>
-      <w:r>
-        <w:rPr>
-          <w:sz w:val="22"/>
-          <w:szCs w:val="22"/>
-        </w:rPr>
-        <w:t>_FIN_SIBEC }}</w:t>
+        <w:t xml:space="preserve">Respecto al plazo de presentación, de la revisión de la documentación presentada, </w:t>
+      </w:r>
+      <w:bookmarkStart w:id="4" w:name="_GoBack"/>
+      <w:bookmarkEnd w:id="4"/>
+      <w:r>
+        <w:rPr>
+          <w:sz w:val="22"/>
+          <w:szCs w:val="22"/>
+        </w:rPr>
+        <w:t>l</w:t>
+      </w:r>
+      <w:r>
+        <w:rPr>
+          <w:sz w:val="22"/>
+          <w:szCs w:val="22"/>
+        </w:rPr>
+        <w:t>a solicitud {{ DEL_BECARIO_A }} fue ingresada por mesa de partes el {{ FECHA_SOLICITUD_TEXTO }}, por lo tanto, se verifica que fue presentado antes de la matrícula e inicio del periodo académico a ampliar.</w:t>
       </w:r>
     </w:p>
     <w:p>
@@ -2993,16 +3174,45 @@
         <w:ind w:left="567"/>
         <w:jc w:val="both"/>
         <w:rPr>
-          <w:sz w:val="22"/>
-          <w:szCs w:val="22"/>
-        </w:rPr>
-      </w:pPr>
-      <w:r>
-        <w:rPr>
-          <w:sz w:val="22"/>
-          <w:szCs w:val="22"/>
-        </w:rPr>
-        <w:t xml:space="preserve">Asimismo, de acuerdo a la duración de estudios programada en el SIBEC, se tuvo previsto que </w:t>
+          <w:i/>
+          <w:sz w:val="22"/>
+          <w:szCs w:val="22"/>
+        </w:rPr>
+      </w:pPr>
+      <w:r>
+        <w:rPr>
+          <w:sz w:val="22"/>
+          <w:szCs w:val="22"/>
+        </w:rPr>
+        <w:t xml:space="preserve">Respecto a los </w:t>
+      </w:r>
+      <w:r>
+        <w:rPr>
+          <w:sz w:val="22"/>
+          <w:szCs w:val="22"/>
+        </w:rPr>
+        <w:t xml:space="preserve">documentos académicos a presentar para acreditar </w:t>
+      </w:r>
+      <w:r>
+        <w:rPr>
+          <w:sz w:val="22"/>
+          <w:szCs w:val="22"/>
+        </w:rPr>
+        <w:t xml:space="preserve">que </w:t>
+      </w:r>
+      <w:r>
+        <w:rPr>
+          <w:sz w:val="22"/>
+          <w:szCs w:val="22"/>
+        </w:rPr>
+        <w:t>aún no se ha culminado la carrera</w:t>
+      </w:r>
+      <w:r>
+        <w:rPr>
+          <w:sz w:val="22"/>
+          <w:szCs w:val="22"/>
+        </w:rPr>
+        <w:t xml:space="preserve">, se revisó la información de los cursos pendientes informados por </w:t>
       </w:r>
       <w:proofErr w:type="gramStart"/>
       <w:r>
@@ -3010,6 +3220,50 @@
           <w:sz w:val="22"/>
           <w:szCs w:val="22"/>
         </w:rPr>
+        <w:t>{{ DEL</w:t>
+      </w:r>
+      <w:proofErr w:type="gramEnd"/>
+      <w:r>
+        <w:rPr>
+          <w:sz w:val="22"/>
+          <w:szCs w:val="22"/>
+        </w:rPr>
+        <w:t xml:space="preserve">_BECARIO_A }} </w:t>
+      </w:r>
+      <w:r>
+        <w:rPr>
+          <w:sz w:val="22"/>
+          <w:szCs w:val="22"/>
+        </w:rPr>
+        <w:t>en su solicitud y la información remitida m</w:t>
+      </w:r>
+      <w:r>
+        <w:rPr>
+          <w:sz w:val="22"/>
+          <w:szCs w:val="22"/>
+        </w:rPr>
+        <w:t xml:space="preserve">ediante {{ CODIGO_DOC_IES }}, de fecha {{ FECHA_DOC_IES_TEXTO }}, </w:t>
+      </w:r>
+      <w:r>
+        <w:rPr>
+          <w:sz w:val="22"/>
+          <w:szCs w:val="22"/>
+        </w:rPr>
+        <w:t xml:space="preserve">en la cual </w:t>
+      </w:r>
+      <w:r>
+        <w:rPr>
+          <w:sz w:val="22"/>
+          <w:szCs w:val="22"/>
+        </w:rPr>
+        <w:t xml:space="preserve">la {{ INSTITUCION }} remite la relación de cursos que tiene pendiente {{ EL_LA_BECARIO_A }} {{ NOMBRE_PRIMERO_NOMBRES }} al finalizar el semestre {{ SEMESTRE_ANTERIOR }}. De la revisión de dicho documento se observa que </w:t>
+      </w:r>
+      <w:proofErr w:type="gramStart"/>
+      <w:r>
+        <w:rPr>
+          <w:sz w:val="22"/>
+          <w:szCs w:val="22"/>
+        </w:rPr>
         <w:t>{{ EL</w:t>
       </w:r>
       <w:proofErr w:type="gramEnd"/>
@@ -3018,7 +3272,166 @@
           <w:sz w:val="22"/>
           <w:szCs w:val="22"/>
         </w:rPr>
-        <w:t>_LA_BECARIO_A }} finalice los estudios en el semestre {{ SEMESTRE_ANTERIOR }}.</w:t>
+        <w:t xml:space="preserve">_LA_BECARIO_A }} tiene cursos pendientes, los cuales acreditan que aún no ha culminado sus estudios y que dichos cursos pueden </w:t>
+      </w:r>
+      <w:r>
+        <w:rPr>
+          <w:sz w:val="22"/>
+          <w:szCs w:val="22"/>
+        </w:rPr>
+        <w:lastRenderedPageBreak/>
+        <w:t>cursarse en un periodo académico adicional, en este caso, en el semestre {{ SEMESTRE_SOLICITADO }}.</w:t>
+      </w:r>
+    </w:p>
+    <w:p>
+      <w:pPr>
+        <w:pStyle w:val="Prrafodelista"/>
+        <w:spacing w:after="0"/>
+        <w:ind w:left="567"/>
+        <w:rPr>
+          <w:rFonts w:ascii="Arial" w:hAnsi="Arial" w:cs="Arial"/>
+          <w:sz w:val="20"/>
+          <w:szCs w:val="20"/>
+        </w:rPr>
+      </w:pPr>
+    </w:p>
+    <w:p>
+      <w:pPr>
+        <w:pStyle w:val="Prrafodelista"/>
+        <w:spacing w:after="0"/>
+        <w:ind w:left="567"/>
+        <w:rPr>
+          <w:rFonts w:ascii="Arial" w:hAnsi="Arial" w:cs="Arial"/>
+          <w:u w:val="single"/>
+        </w:rPr>
+      </w:pPr>
+      <w:r>
+        <w:rPr>
+          <w:rFonts w:ascii="Arial" w:hAnsi="Arial" w:cs="Arial"/>
+          <w:u w:val="single"/>
+        </w:rPr>
+        <w:t xml:space="preserve">Listado de cursos pendientes que tiene </w:t>
+      </w:r>
+      <w:proofErr w:type="gramStart"/>
+      <w:r>
+        <w:rPr>
+          <w:rFonts w:ascii="Arial" w:hAnsi="Arial" w:cs="Arial"/>
+          <w:u w:val="single"/>
+        </w:rPr>
+        <w:t>{{ EL</w:t>
+      </w:r>
+      <w:proofErr w:type="gramEnd"/>
+      <w:r>
+        <w:rPr>
+          <w:rFonts w:ascii="Arial" w:hAnsi="Arial" w:cs="Arial"/>
+          <w:u w:val="single"/>
+        </w:rPr>
+        <w:t>_LA_BECARIO_A }}:</w:t>
+      </w:r>
+    </w:p>
+    <w:p>
+      <w:pPr>
+        <w:spacing w:after="0"/>
+        <w:ind w:firstLine="567"/>
+        <w:rPr>
+          <w:rFonts w:ascii="Arial" w:hAnsi="Arial" w:cs="Arial"/>
+        </w:rPr>
+      </w:pPr>
+      <w:proofErr w:type="gramStart"/>
+      <w:r>
+        <w:rPr>
+          <w:rFonts w:ascii="Arial" w:hAnsi="Arial" w:cs="Arial"/>
+        </w:rPr>
+        <w:t>{{ CURSOS</w:t>
+      </w:r>
+      <w:proofErr w:type="gramEnd"/>
+      <w:r>
+        <w:rPr>
+          <w:rFonts w:ascii="Arial" w:hAnsi="Arial" w:cs="Arial"/>
+        </w:rPr>
+        <w:t>_PENDIENTES }}</w:t>
+      </w:r>
+    </w:p>
+    <w:p>
+      <w:pPr>
+        <w:spacing w:after="0"/>
+        <w:rPr>
+          <w:rFonts w:ascii="Arial" w:hAnsi="Arial" w:cs="Arial"/>
+        </w:rPr>
+      </w:pPr>
+    </w:p>
+    <w:p>
+      <w:pPr>
+        <w:pStyle w:val="Default"/>
+        <w:numPr>
+          <w:ilvl w:val="1"/>
+          <w:numId w:val="11"/>
+        </w:numPr>
+        <w:ind w:left="567"/>
+        <w:jc w:val="both"/>
+        <w:rPr>
+          <w:sz w:val="22"/>
+          <w:szCs w:val="22"/>
+        </w:rPr>
+      </w:pPr>
+      <w:r>
+        <w:rPr>
+          <w:sz w:val="22"/>
+          <w:szCs w:val="22"/>
+        </w:rPr>
+        <w:t xml:space="preserve">Respecto a que los cursos pendientes deben ser suficientes para culminar la carrera o programa de estudios y deben efectuarse en el periodo académico inmediato posterior al término del periodo de estudios programado, el documento de la IES informa que con dichos cursos </w:t>
+      </w:r>
+      <w:proofErr w:type="gramStart"/>
+      <w:r>
+        <w:rPr>
+          <w:sz w:val="22"/>
+          <w:szCs w:val="22"/>
+        </w:rPr>
+        <w:t>{{ EL</w:t>
+      </w:r>
+      <w:proofErr w:type="gramEnd"/>
+      <w:r>
+        <w:rPr>
+          <w:sz w:val="22"/>
+          <w:szCs w:val="22"/>
+        </w:rPr>
+        <w:t>_LA_BECARIO_A }}</w:t>
+      </w:r>
+      <w:r>
+        <w:rPr>
+          <w:sz w:val="22"/>
+          <w:szCs w:val="22"/>
+          <w:u w:val="single"/>
+        </w:rPr>
+        <w:t xml:space="preserve"> </w:t>
+      </w:r>
+      <w:r>
+        <w:rPr>
+          <w:sz w:val="22"/>
+          <w:szCs w:val="22"/>
+        </w:rPr>
+        <w:t xml:space="preserve">podría culminar su respectiva carrera de estudios en el periodo académico solicitado. Asimismo, se verifica que </w:t>
+      </w:r>
+      <w:r>
+        <w:rPr>
+          <w:sz w:val="22"/>
+          <w:szCs w:val="22"/>
+        </w:rPr>
+        <w:t xml:space="preserve">el periodo </w:t>
+      </w:r>
+      <w:r>
+        <w:rPr>
+          <w:sz w:val="22"/>
+          <w:szCs w:val="22"/>
+        </w:rPr>
+        <w:t xml:space="preserve">de ampliación </w:t>
+      </w:r>
+      <w:r>
+        <w:rPr>
+          <w:sz w:val="22"/>
+          <w:szCs w:val="22"/>
+        </w:rPr>
+        <w:t>solicitado (2026-II) es posterior y continuo al último periodo programado en el SIBEC (2026-I).</w:t>
       </w:r>
     </w:p>
     <w:p>
@@ -3027,8 +3440,201 @@
         <w:ind w:left="567"/>
         <w:jc w:val="both"/>
         <w:rPr>
-          <w:sz w:val="16"/>
-          <w:szCs w:val="16"/>
+          <w:sz w:val="22"/>
+          <w:szCs w:val="22"/>
+        </w:rPr>
+      </w:pPr>
+    </w:p>
+    <w:p>
+      <w:pPr>
+        <w:pStyle w:val="Default"/>
+        <w:numPr>
+          <w:ilvl w:val="1"/>
+          <w:numId w:val="11"/>
+        </w:numPr>
+        <w:ind w:left="567"/>
+        <w:jc w:val="both"/>
+        <w:rPr>
+          <w:sz w:val="22"/>
+          <w:szCs w:val="22"/>
+        </w:rPr>
+      </w:pPr>
+      <w:r>
+        <w:rPr>
+          <w:sz w:val="22"/>
+          <w:szCs w:val="22"/>
+        </w:rPr>
+        <w:t xml:space="preserve">De acuerdo con el Sistema Integrado de Becas y Crédito Educativo (SIBEC), </w:t>
+      </w:r>
+      <w:proofErr w:type="gramStart"/>
+      <w:r>
+        <w:rPr>
+          <w:sz w:val="22"/>
+          <w:szCs w:val="22"/>
+        </w:rPr>
+        <w:t>{{ EL</w:t>
+      </w:r>
+      <w:proofErr w:type="gramEnd"/>
+      <w:r>
+        <w:rPr>
+          <w:sz w:val="22"/>
+          <w:szCs w:val="22"/>
+        </w:rPr>
+        <w:t>_LA_BECARIO_A }} tiene registrada la siguiente programación:</w:t>
+      </w:r>
+    </w:p>
+    <w:p>
+      <w:pPr>
+        <w:pStyle w:val="Default"/>
+        <w:ind w:left="567"/>
+        <w:jc w:val="both"/>
+        <w:rPr>
+          <w:sz w:val="22"/>
+          <w:szCs w:val="22"/>
+        </w:rPr>
+      </w:pPr>
+    </w:p>
+    <w:p>
+      <w:pPr>
+        <w:pStyle w:val="Default"/>
+        <w:ind w:left="567"/>
+        <w:jc w:val="both"/>
+        <w:rPr>
+          <w:sz w:val="22"/>
+          <w:szCs w:val="22"/>
+        </w:rPr>
+      </w:pPr>
+      <w:r>
+        <w:rPr>
+          <w:sz w:val="22"/>
+          <w:szCs w:val="22"/>
+        </w:rPr>
+        <w:t>Inicio</w:t>
+      </w:r>
+      <w:r>
+        <w:rPr>
+          <w:sz w:val="22"/>
+          <w:szCs w:val="22"/>
+        </w:rPr>
+        <w:tab/>
+        <w:t xml:space="preserve">: </w:t>
+      </w:r>
+      <w:proofErr w:type="gramStart"/>
+      <w:r>
+        <w:rPr>
+          <w:sz w:val="22"/>
+          <w:szCs w:val="22"/>
+        </w:rPr>
+        <w:t>{{ FECHA</w:t>
+      </w:r>
+      <w:proofErr w:type="gramEnd"/>
+      <w:r>
+        <w:rPr>
+          <w:sz w:val="22"/>
+          <w:szCs w:val="22"/>
+        </w:rPr>
+        <w:t>_INICIO_SIBEC }}</w:t>
+      </w:r>
+    </w:p>
+    <w:p>
+      <w:pPr>
+        <w:pStyle w:val="Default"/>
+        <w:ind w:left="567"/>
+        <w:jc w:val="both"/>
+        <w:rPr>
+          <w:sz w:val="22"/>
+          <w:szCs w:val="22"/>
+        </w:rPr>
+      </w:pPr>
+      <w:r>
+        <w:rPr>
+          <w:sz w:val="22"/>
+          <w:szCs w:val="22"/>
+        </w:rPr>
+        <w:t>Fin</w:t>
+      </w:r>
+      <w:r>
+        <w:rPr>
+          <w:sz w:val="22"/>
+          <w:szCs w:val="22"/>
+        </w:rPr>
+        <w:tab/>
+        <w:t xml:space="preserve">: </w:t>
+      </w:r>
+      <w:proofErr w:type="gramStart"/>
+      <w:r>
+        <w:rPr>
+          <w:sz w:val="22"/>
+          <w:szCs w:val="22"/>
+        </w:rPr>
+        <w:t>{{ FECHA</w:t>
+      </w:r>
+      <w:proofErr w:type="gramEnd"/>
+      <w:r>
+        <w:rPr>
+          <w:sz w:val="22"/>
+          <w:szCs w:val="22"/>
+        </w:rPr>
+        <w:t>_FIN_SIBEC }}</w:t>
+      </w:r>
+    </w:p>
+    <w:p>
+      <w:pPr>
+        <w:pStyle w:val="Default"/>
+        <w:ind w:left="567"/>
+        <w:jc w:val="both"/>
+        <w:rPr>
+          <w:sz w:val="22"/>
+          <w:szCs w:val="22"/>
+        </w:rPr>
+      </w:pPr>
+    </w:p>
+    <w:p>
+      <w:pPr>
+        <w:pStyle w:val="Default"/>
+        <w:numPr>
+          <w:ilvl w:val="1"/>
+          <w:numId w:val="11"/>
+        </w:numPr>
+        <w:ind w:left="567"/>
+        <w:jc w:val="both"/>
+        <w:rPr>
+          <w:sz w:val="22"/>
+          <w:szCs w:val="22"/>
+        </w:rPr>
+      </w:pPr>
+      <w:r>
+        <w:rPr>
+          <w:sz w:val="22"/>
+          <w:szCs w:val="22"/>
+        </w:rPr>
+        <w:t xml:space="preserve">Asimismo, de acuerdo a la duración de estudios programada en el SIBEC, se tuvo previsto que </w:t>
+      </w:r>
+      <w:proofErr w:type="gramStart"/>
+      <w:r>
+        <w:rPr>
+          <w:sz w:val="22"/>
+          <w:szCs w:val="22"/>
+        </w:rPr>
+        <w:t>{{ EL</w:t>
+      </w:r>
+      <w:proofErr w:type="gramEnd"/>
+      <w:r>
+        <w:rPr>
+          <w:sz w:val="22"/>
+          <w:szCs w:val="22"/>
+        </w:rPr>
+        <w:t>_LA_BECARIO_A }} finalice los estudios en el semestre {{ SEMESTRE_ANTERIOR }}.</w:t>
+      </w:r>
+    </w:p>
+    <w:p>
+      <w:pPr>
+        <w:pStyle w:val="Default"/>
+        <w:ind w:left="567"/>
+        <w:jc w:val="both"/>
+        <w:rPr>
+          <w:sz w:val="22"/>
+          <w:szCs w:val="22"/>
         </w:rPr>
       </w:pPr>
     </w:p>
@@ -3821,8 +4427,8 @@
         <w:ind w:left="567"/>
         <w:jc w:val="both"/>
         <w:rPr>
-          <w:sz w:val="16"/>
-          <w:szCs w:val="16"/>
+          <w:sz w:val="22"/>
+          <w:szCs w:val="22"/>
         </w:rPr>
       </w:pPr>
     </w:p>
@@ -3899,8 +4505,6 @@
         <w:rPr>
           <w:rFonts w:ascii="Arial" w:eastAsia="Arial" w:hAnsi="Arial" w:cs="Arial"/>
           <w:b/>
-          <w:sz w:val="20"/>
-          <w:szCs w:val="20"/>
           <w:lang w:val="es-ES"/>
         </w:rPr>
       </w:pPr>
@@ -3962,7 +4566,14 @@
         <w:rPr>
           <w:rFonts w:ascii="Arial" w:hAnsi="Arial" w:cs="Arial"/>
         </w:rPr>
-        <w:t>_INFORME_SUCCOR }} se concluye que {{ EL_LA_BECARIO_A }} {{ NOMBRE_PRIMERO_NOMBRES }} cumple con los supuestos establecidos en el literal a) del artículo 30 del Reglamento de la Ley Nº 29837 y las Disposiciones para el becario del PRONABEC, por lo tanto, resulta viable la ampliación excepcional de la duración del periodo de estudios por el semestre {{ SEMESTRE_SOLICITADO }}.</w:t>
+        <w:t xml:space="preserve">_INFORME_SUCCOR }} se concluye que {{ EL_LA_BECARIO_A }} {{ NOMBRE_PRIMERO_NOMBRES }} cumple con los supuestos establecidos en el literal a) del artículo 30 del Reglamento de la Ley Nº 29837 y las Disposiciones para el becario del PRONABEC, por lo tanto, resulta </w:t>
+      </w:r>
+      <w:r>
+        <w:rPr>
+          <w:rFonts w:ascii="Arial" w:hAnsi="Arial" w:cs="Arial"/>
+        </w:rPr>
+        <w:lastRenderedPageBreak/>
+        <w:t>viable la ampliación excepcional de la duración del periodo de estudios por el semestre {{ SEMESTRE_SOLICITADO }}.</w:t>
       </w:r>
     </w:p>
     <w:p>
@@ -4199,19 +4810,6 @@
     </w:p>
     <w:p>
       <w:pPr>
-        <w:widowControl w:val="0"/>
-        <w:autoSpaceDE w:val="0"/>
-        <w:autoSpaceDN w:val="0"/>
-        <w:spacing w:after="0" w:line="240" w:lineRule="auto"/>
-        <w:rPr>
-          <w:rFonts w:ascii="Arial" w:eastAsia="Arial" w:hAnsi="Arial" w:cs="Arial"/>
-          <w:bCs/>
-          <w:lang w:val="es-ES"/>
-        </w:rPr>
-      </w:pPr>
-    </w:p>
-    <w:p>
-      <w:pPr>
         <w:spacing w:after="0" w:line="240" w:lineRule="auto"/>
         <w:ind w:right="3"/>
         <w:jc w:val="both"/>
@@ -4399,6 +4997,128 @@
           <w:lang w:val="es-ES"/>
         </w:rPr>
       </w:pPr>
+    </w:p>
+    <w:p>
+      <w:pPr>
+        <w:pStyle w:val="Default"/>
+        <w:jc w:val="both"/>
+        <w:rPr>
+          <w:rFonts w:eastAsia="Arial"/>
+          <w:bCs/>
+          <w:lang w:val="es-ES"/>
+        </w:rPr>
+      </w:pPr>
+    </w:p>
+    <w:p>
+      <w:pPr>
+        <w:pStyle w:val="Default"/>
+        <w:jc w:val="both"/>
+        <w:rPr>
+          <w:rFonts w:eastAsia="Arial"/>
+          <w:bCs/>
+          <w:lang w:val="es-ES"/>
+        </w:rPr>
+      </w:pPr>
+    </w:p>
+    <w:p>
+      <w:pPr>
+        <w:pStyle w:val="Default"/>
+        <w:jc w:val="both"/>
+        <w:rPr>
+          <w:rFonts w:eastAsia="Arial"/>
+          <w:bCs/>
+          <w:lang w:val="es-ES"/>
+        </w:rPr>
+      </w:pPr>
+    </w:p>
+    <w:p>
+      <w:pPr>
+        <w:pStyle w:val="Default"/>
+        <w:jc w:val="both"/>
+        <w:rPr>
+          <w:rFonts w:eastAsia="Arial"/>
+          <w:bCs/>
+          <w:lang w:val="es-ES"/>
+        </w:rPr>
+      </w:pPr>
+    </w:p>
+    <w:p>
+      <w:pPr>
+        <w:pStyle w:val="Default"/>
+        <w:jc w:val="both"/>
+        <w:rPr>
+          <w:rFonts w:eastAsia="Arial"/>
+          <w:bCs/>
+          <w:lang w:val="es-ES"/>
+        </w:rPr>
+      </w:pPr>
+    </w:p>
+    <w:p>
+      <w:pPr>
+        <w:pStyle w:val="Default"/>
+        <w:jc w:val="both"/>
+        <w:rPr>
+          <w:rFonts w:eastAsia="Arial"/>
+          <w:bCs/>
+          <w:sz w:val="20"/>
+          <w:szCs w:val="20"/>
+          <w:lang w:val="es-ES"/>
+        </w:rPr>
+      </w:pPr>
+      <w:r>
+        <w:rPr>
+          <w:rFonts w:eastAsia="Arial"/>
+          <w:bCs/>
+          <w:sz w:val="20"/>
+          <w:szCs w:val="20"/>
+          <w:lang w:val="es-ES"/>
+        </w:rPr>
+        <w:t>ASV/</w:t>
+      </w:r>
+      <w:proofErr w:type="spellStart"/>
+      <w:r>
+        <w:rPr>
+          <w:rFonts w:eastAsia="Arial"/>
+          <w:bCs/>
+          <w:sz w:val="20"/>
+          <w:szCs w:val="20"/>
+          <w:lang w:val="es-ES"/>
+        </w:rPr>
+        <w:t>j</w:t>
+      </w:r>
+      <w:r>
+        <w:rPr>
+          <w:rFonts w:eastAsia="Arial"/>
+          <w:bCs/>
+          <w:sz w:val="20"/>
+          <w:szCs w:val="20"/>
+          <w:lang w:val="es-ES"/>
+        </w:rPr>
+        <w:t>obs</w:t>
+      </w:r>
+      <w:proofErr w:type="spellEnd"/>
+      <w:r>
+        <w:rPr>
+          <w:rFonts w:eastAsia="Arial"/>
+          <w:bCs/>
+          <w:sz w:val="20"/>
+          <w:szCs w:val="20"/>
+          <w:lang w:val="es-ES"/>
+        </w:rPr>
+        <w:t>/</w:t>
+      </w:r>
+      <w:proofErr w:type="spellStart"/>
+      <w:r>
+        <w:rPr>
+          <w:rFonts w:eastAsia="Arial"/>
+          <w:bCs/>
+          <w:sz w:val="20"/>
+          <w:szCs w:val="20"/>
+          <w:lang w:val="es-ES"/>
+        </w:rPr>
+        <w:t>jgds</w:t>
+      </w:r>
+      <w:proofErr w:type="spellEnd"/>
     </w:p>
     <w:sectPr>
       <w:headerReference w:type="default" r:id="rId8"/>
@@ -4457,7 +5177,7 @@
       <mc:AlternateContent>
         <mc:Choice Requires="wps">
           <w:drawing>
-            <wp:anchor distT="45720" distB="45720" distL="114300" distR="114300" simplePos="0" relativeHeight="251660288" behindDoc="0" locked="0" layoutInCell="1" allowOverlap="1" wp14:anchorId="066252C6" wp14:editId="5076C5AD">
+            <wp:anchor distT="45720" distB="45720" distL="114300" distR="114300" simplePos="0" relativeHeight="251660288" behindDoc="0" locked="0" layoutInCell="1" allowOverlap="1" wp14:anchorId="066252C6" wp14:editId="473A5D14">
               <wp:simplePos x="0" y="0"/>
               <wp:positionH relativeFrom="column">
                 <wp:posOffset>797560</wp:posOffset>
@@ -4637,13 +5357,13 @@
             </wp:anchor>
           </w:drawing>
         </mc:Choice>
-        <mc:Fallback xmlns:w16sdtfl="http://schemas.microsoft.com/office/word/2024/wordml/sdtformatlock" xmlns:w16sdtdh="http://schemas.microsoft.com/office/word/2020/wordml/sdtdatahash" xmlns:w16du="http://schemas.microsoft.com/office/word/2023/wordml/word16du" xmlns:w16="http://schemas.microsoft.com/office/word/2018/wordml" xmlns:w16cid="http://schemas.microsoft.com/office/word/2016/wordml/cid" xmlns:w16cex="http://schemas.microsoft.com/office/word/2018/wordml/cex" xmlns:oel="http://schemas.microsoft.com/office/2019/extlst" xmlns:am3d="http://schemas.microsoft.com/office/drawing/2017/model3d" xmlns:aink="http://schemas.microsoft.com/office/drawing/2016/ink" xmlns:cx8="http://schemas.microsoft.com/office/drawing/2016/5/14/chartex" xmlns:cx7="http://schemas.microsoft.com/office/drawing/2016/5/13/chartex" xmlns:cx6="http://schemas.microsoft.com/office/drawing/2016/5/12/chartex" xmlns:cx5="http://schemas.microsoft.com/office/drawing/2016/5/11/chartex" xmlns:cx4="http://schemas.microsoft.com/office/drawing/2016/5/10/chartex" xmlns:cx3="http://schemas.microsoft.com/office/drawing/2016/5/9/chartex" xmlns:cx2="http://schemas.microsoft.com/office/drawing/2015/10/21/chartex" xmlns:cx1="http://schemas.microsoft.com/office/drawing/2015/9/8/chartex">
+        <mc:Fallback>
           <w:pict>
             <v:shapetype w14:anchorId="066252C6" id="_x0000_t202" coordsize="21600,21600" o:spt="202" path="m,l,21600r21600,l21600,xe">
               <v:stroke joinstyle="miter"/>
               <v:path gradientshapeok="t" o:connecttype="rect"/>
             </v:shapetype>
-            <v:shape id="Cuadro de texto 2" o:spid="_x0000_s1026" type="#_x0000_t202" style="position:absolute;margin-left:62.8pt;margin-top:14.45pt;width:159pt;height:137.2pt;z-index:251660288;visibility:visible;mso-wrap-style:none;mso-width-percent:0;mso-height-percent:200;mso-wrap-distance-left:9pt;mso-wrap-distance-top:3.6pt;mso-wrap-distance-right:9pt;mso-wrap-distance-bottom:3.6pt;mso-position-horizontal:absolute;mso-position-horizontal-relative:text;mso-position-vertical:absolute;mso-position-vertical-relative:text;mso-width-percent:0;mso-height-percent:200;mso-width-relative:margin;mso-height-relative:margin;v-text-anchor:top" o:gfxdata="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" filled="f" stroked="f">
+            <v:shape id="Cuadro de texto 2" o:spid="_x0000_s1026" type="#_x0000_t202" style="position:absolute;margin-left:62.8pt;margin-top:14.45pt;width:159pt;height:137.2pt;z-index:251660288;visibility:visible;mso-wrap-style:none;mso-width-percent:0;mso-height-percent:200;mso-wrap-distance-left:9pt;mso-wrap-distance-top:3.6pt;mso-wrap-distance-right:9pt;mso-wrap-distance-bottom:3.6pt;mso-position-horizontal:absolute;mso-position-horizontal-relative:text;mso-position-vertical:absolute;mso-position-vertical-relative:text;mso-width-percent:0;mso-height-percent:200;mso-width-relative:margin;mso-height-relative:margin;v-text-anchor:top" o:gfxdata="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" filled="f" stroked="f">
               <v:textbox style="mso-fit-shape-to-text:t" inset="0,0,0,0">
                 <w:txbxContent>
                   <w:p>
@@ -4867,6 +5587,67 @@
     </w:pPr>
     <w:r>
       <w:rPr>
+        <w:noProof/>
+        <w:lang w:eastAsia="es-PE"/>
+      </w:rPr>
+      <w:drawing>
+        <wp:anchor distT="0" distB="0" distL="114300" distR="114300" simplePos="0" relativeHeight="251663360" behindDoc="0" locked="0" layoutInCell="1" allowOverlap="1" wp14:anchorId="11846ED0" wp14:editId="156C39FA">
+          <wp:simplePos x="0" y="0"/>
+          <wp:positionH relativeFrom="column">
+            <wp:posOffset>3987165</wp:posOffset>
+          </wp:positionH>
+          <wp:positionV relativeFrom="paragraph">
+            <wp:posOffset>6350</wp:posOffset>
+          </wp:positionV>
+          <wp:extent cx="1704975" cy="476885"/>
+          <wp:effectExtent l="0" t="0" r="9525" b="0"/>
+          <wp:wrapSquare wrapText="bothSides"/>
+          <wp:docPr id="1" name="Imagen 1"/>
+          <wp:cNvGraphicFramePr>
+            <a:graphicFrameLocks xmlns:a="http://schemas.openxmlformats.org/drawingml/2006/main" noChangeAspect="1"/>
+          </wp:cNvGraphicFramePr>
+          <a:graphic xmlns:a="http://schemas.openxmlformats.org/drawingml/2006/main">
+            <a:graphicData uri="http://schemas.openxmlformats.org/drawingml/2006/picture">
+              <pic:pic xmlns:pic="http://schemas.openxmlformats.org/drawingml/2006/picture">
+                <pic:nvPicPr>
+                  <pic:cNvPr id="1" name="peru-responde-logo.png"/>
+                  <pic:cNvPicPr/>
+                </pic:nvPicPr>
+                <pic:blipFill>
+                  <a:blip r:embed="rId2">
+                    <a:extLst>
+                      <a:ext uri="{28A0092B-C50C-407E-A947-70E740481C1C}">
+                        <a14:useLocalDpi xmlns:a14="http://schemas.microsoft.com/office/drawing/2010/main" val="0"/>
+                      </a:ext>
+                    </a:extLst>
+                  </a:blip>
+                  <a:stretch>
+                    <a:fillRect/>
+                  </a:stretch>
+                </pic:blipFill>
+                <pic:spPr>
+                  <a:xfrm>
+                    <a:off x="0" y="0"/>
+                    <a:ext cx="1704975" cy="476885"/>
+                  </a:xfrm>
+                  <a:prstGeom prst="rect">
+                    <a:avLst/>
+                  </a:prstGeom>
+                </pic:spPr>
+              </pic:pic>
+            </a:graphicData>
+          </a:graphic>
+          <wp14:sizeRelH relativeFrom="page">
+            <wp14:pctWidth>0</wp14:pctWidth>
+          </wp14:sizeRelH>
+          <wp14:sizeRelV relativeFrom="page">
+            <wp14:pctHeight>0</wp14:pctHeight>
+          </wp14:sizeRelV>
+        </wp:anchor>
+      </w:drawing>
+    </w:r>
+    <w:r>
+      <w:rPr>
         <w:color w:val="0F243E"/>
         <w:sz w:val="20"/>
         <w:szCs w:val="20"/>
@@ -4932,13 +5713,13 @@
         <w:lang w:eastAsia="es-PE"/>
       </w:rPr>
       <w:drawing>
-        <wp:anchor distT="0" distB="0" distL="114300" distR="114300" simplePos="0" relativeHeight="251659264" behindDoc="1" locked="0" layoutInCell="1" allowOverlap="1" wp14:anchorId="65795235" wp14:editId="7A53A726">
+        <wp:anchor distT="0" distB="0" distL="114300" distR="114300" simplePos="0" relativeHeight="251659264" behindDoc="1" locked="0" layoutInCell="1" allowOverlap="1" wp14:anchorId="65795235" wp14:editId="18F44EF3">
           <wp:simplePos x="0" y="0"/>
           <wp:positionH relativeFrom="margin">
-            <wp:align>center</wp:align>
+            <wp:posOffset>-537845</wp:posOffset>
           </wp:positionH>
           <wp:positionV relativeFrom="paragraph">
-            <wp:posOffset>-383540</wp:posOffset>
+            <wp:posOffset>-345440</wp:posOffset>
           </wp:positionV>
           <wp:extent cx="5028204" cy="457835"/>
           <wp:effectExtent l="0" t="0" r="1270" b="0"/>
@@ -6755,6 +7536,95 @@
     </w:lvl>
   </w:abstractNum>
   <w:abstractNum w:abstractNumId="16" w15:restartNumberingAfterBreak="0">
+    <w:nsid w:val="3E353BAF"/>
+    <w:multiLevelType w:val="hybridMultilevel"/>
+    <w:tmpl w:val="CD3E4940"/>
+    <w:lvl w:ilvl="0" w:tplc="D0EA4014">
+      <w:start w:val="1"/>
+      <w:numFmt w:val="lowerLetter"/>
+      <w:lvlText w:val="%1)"/>
+      <w:lvlJc w:val="left"/>
+      <w:pPr>
+        <w:ind w:left="927" w:hanging="360"/>
+      </w:pPr>
+      <w:rPr>
+        <w:rFonts w:hint="default"/>
+      </w:rPr>
+    </w:lvl>
+    <w:lvl w:ilvl="1" w:tplc="280A0019" w:tentative="1">
+      <w:start w:val="1"/>
+      <w:numFmt w:val="lowerLetter"/>
+      <w:lvlText w:val="%2."/>
+      <w:lvlJc w:val="left"/>
+      <w:pPr>
+        <w:ind w:left="1647" w:hanging="360"/>
+      </w:pPr>
+    </w:lvl>
+    <w:lvl w:ilvl="2" w:tplc="280A001B" w:tentative="1">
+      <w:start w:val="1"/>
+      <w:numFmt w:val="lowerRoman"/>
+      <w:lvlText w:val="%3."/>
+      <w:lvlJc w:val="right"/>
+      <w:pPr>
+        <w:ind w:left="2367" w:hanging="180"/>
+      </w:pPr>
+    </w:lvl>
+    <w:lvl w:ilvl="3" w:tplc="280A000F" w:tentative="1">
+      <w:start w:val="1"/>
+      <w:numFmt w:val="decimal"/>
+      <w:lvlText w:val="%4."/>
+      <w:lvlJc w:val="left"/>
+      <w:pPr>
+        <w:ind w:left="3087" w:hanging="360"/>
+      </w:pPr>
+    </w:lvl>
+    <w:lvl w:ilvl="4" w:tplc="280A0019" w:tentative="1">
+      <w:start w:val="1"/>
+      <w:numFmt w:val="lowerLetter"/>
+      <w:lvlText w:val="%5."/>
+      <w:lvlJc w:val="left"/>
+      <w:pPr>
+        <w:ind w:left="3807" w:hanging="360"/>
+      </w:pPr>
+    </w:lvl>
+    <w:lvl w:ilvl="5" w:tplc="280A001B" w:tentative="1">
+      <w:start w:val="1"/>
+      <w:numFmt w:val="lowerRoman"/>
+      <w:lvlText w:val="%6."/>
+      <w:lvlJc w:val="right"/>
+      <w:pPr>
+        <w:ind w:left="4527" w:hanging="180"/>
+      </w:pPr>
+    </w:lvl>
+    <w:lvl w:ilvl="6" w:tplc="280A000F" w:tentative="1">
+      <w:start w:val="1"/>
+      <w:numFmt w:val="decimal"/>
+      <w:lvlText w:val="%7."/>
+      <w:lvlJc w:val="left"/>
+      <w:pPr>
+        <w:ind w:left="5247" w:hanging="360"/>
+      </w:pPr>
+    </w:lvl>
+    <w:lvl w:ilvl="7" w:tplc="280A0019" w:tentative="1">
+      <w:start w:val="1"/>
+      <w:numFmt w:val="lowerLetter"/>
+      <w:lvlText w:val="%8."/>
+      <w:lvlJc w:val="left"/>
+      <w:pPr>
+        <w:ind w:left="5967" w:hanging="360"/>
+      </w:pPr>
+    </w:lvl>
+    <w:lvl w:ilvl="8" w:tplc="280A001B" w:tentative="1">
+      <w:start w:val="1"/>
+      <w:numFmt w:val="lowerRoman"/>
+      <w:lvlText w:val="%9."/>
+      <w:lvlJc w:val="right"/>
+      <w:pPr>
+        <w:ind w:left="6687" w:hanging="180"/>
+      </w:pPr>
+    </w:lvl>
+  </w:abstractNum>
+  <w:abstractNum w:abstractNumId="17" w15:restartNumberingAfterBreak="0">
     <w:nsid w:val="4066448E"/>
     <w:multiLevelType w:val="multilevel"/>
     <w:tmpl w:val="DE586F6A"/>
@@ -6875,7 +7745,7 @@
       </w:rPr>
     </w:lvl>
   </w:abstractNum>
-  <w:abstractNum w:abstractNumId="17" w15:restartNumberingAfterBreak="0">
+  <w:abstractNum w:abstractNumId="18" w15:restartNumberingAfterBreak="0">
     <w:nsid w:val="45906257"/>
     <w:multiLevelType w:val="hybridMultilevel"/>
     <w:tmpl w:val="43C09100"/>
@@ -6964,7 +7834,7 @@
       </w:pPr>
     </w:lvl>
   </w:abstractNum>
-  <w:abstractNum w:abstractNumId="18" w15:restartNumberingAfterBreak="0">
+  <w:abstractNum w:abstractNumId="19" w15:restartNumberingAfterBreak="0">
     <w:nsid w:val="4DD40551"/>
     <w:multiLevelType w:val="multilevel"/>
     <w:tmpl w:val="7CB4A43A"/>
@@ -7087,7 +7957,7 @@
       </w:rPr>
     </w:lvl>
   </w:abstractNum>
-  <w:abstractNum w:abstractNumId="19" w15:restartNumberingAfterBreak="0">
+  <w:abstractNum w:abstractNumId="20" w15:restartNumberingAfterBreak="0">
     <w:nsid w:val="4E0B3DCD"/>
     <w:multiLevelType w:val="hybridMultilevel"/>
     <w:tmpl w:val="B0D21666"/>
@@ -7176,7 +8046,7 @@
       </w:pPr>
     </w:lvl>
   </w:abstractNum>
-  <w:abstractNum w:abstractNumId="20" w15:restartNumberingAfterBreak="0">
+  <w:abstractNum w:abstractNumId="21" w15:restartNumberingAfterBreak="0">
     <w:nsid w:val="5077EDB2"/>
     <w:multiLevelType w:val="hybridMultilevel"/>
     <w:tmpl w:val="1A895284"/>
@@ -7227,7 +8097,7 @@
       <w:lvlJc w:val="left"/>
     </w:lvl>
   </w:abstractNum>
-  <w:abstractNum w:abstractNumId="21" w15:restartNumberingAfterBreak="0">
+  <w:abstractNum w:abstractNumId="22" w15:restartNumberingAfterBreak="0">
     <w:nsid w:val="50CD0CCE"/>
     <w:multiLevelType w:val="multilevel"/>
     <w:tmpl w:val="C0620BCA"/>
@@ -7340,7 +8210,7 @@
       </w:rPr>
     </w:lvl>
   </w:abstractNum>
-  <w:abstractNum w:abstractNumId="22" w15:restartNumberingAfterBreak="0">
+  <w:abstractNum w:abstractNumId="23" w15:restartNumberingAfterBreak="0">
     <w:nsid w:val="56875437"/>
     <w:multiLevelType w:val="multilevel"/>
     <w:tmpl w:val="0D70FCC2"/>
@@ -7489,7 +8359,7 @@
       </w:rPr>
     </w:lvl>
   </w:abstractNum>
-  <w:abstractNum w:abstractNumId="23" w15:restartNumberingAfterBreak="0">
+  <w:abstractNum w:abstractNumId="24" w15:restartNumberingAfterBreak="0">
     <w:nsid w:val="59043FEA"/>
     <w:multiLevelType w:val="multilevel"/>
     <w:tmpl w:val="7B92FAD2"/>
@@ -7603,7 +8473,7 @@
       </w:rPr>
     </w:lvl>
   </w:abstractNum>
-  <w:abstractNum w:abstractNumId="24" w15:restartNumberingAfterBreak="0">
+  <w:abstractNum w:abstractNumId="25" w15:restartNumberingAfterBreak="0">
     <w:nsid w:val="5A5D73AC"/>
     <w:multiLevelType w:val="hybridMultilevel"/>
     <w:tmpl w:val="21AC45B2"/>
@@ -7692,7 +8562,7 @@
       </w:pPr>
     </w:lvl>
   </w:abstractNum>
-  <w:abstractNum w:abstractNumId="25" w15:restartNumberingAfterBreak="0">
+  <w:abstractNum w:abstractNumId="26" w15:restartNumberingAfterBreak="0">
     <w:nsid w:val="5A6068D8"/>
     <w:multiLevelType w:val="multilevel"/>
     <w:tmpl w:val="C1C65BC2"/>
@@ -7808,7 +8678,7 @@
       </w:rPr>
     </w:lvl>
   </w:abstractNum>
-  <w:abstractNum w:abstractNumId="26" w15:restartNumberingAfterBreak="0">
+  <w:abstractNum w:abstractNumId="27" w15:restartNumberingAfterBreak="0">
     <w:nsid w:val="5D734E90"/>
     <w:multiLevelType w:val="multilevel"/>
     <w:tmpl w:val="7B92FAD2"/>
@@ -7922,7 +8792,7 @@
       </w:rPr>
     </w:lvl>
   </w:abstractNum>
-  <w:abstractNum w:abstractNumId="27" w15:restartNumberingAfterBreak="0">
+  <w:abstractNum w:abstractNumId="28" w15:restartNumberingAfterBreak="0">
     <w:nsid w:val="5FA86D92"/>
     <w:multiLevelType w:val="hybridMultilevel"/>
     <w:tmpl w:val="38C2FCA2"/>
@@ -8011,7 +8881,7 @@
       </w:pPr>
     </w:lvl>
   </w:abstractNum>
-  <w:abstractNum w:abstractNumId="28" w15:restartNumberingAfterBreak="0">
+  <w:abstractNum w:abstractNumId="29" w15:restartNumberingAfterBreak="0">
     <w:nsid w:val="649D2D1D"/>
     <w:multiLevelType w:val="multilevel"/>
     <w:tmpl w:val="BEAE9FB6"/>
@@ -8124,7 +8994,7 @@
       </w:rPr>
     </w:lvl>
   </w:abstractNum>
-  <w:abstractNum w:abstractNumId="29" w15:restartNumberingAfterBreak="0">
+  <w:abstractNum w:abstractNumId="30" w15:restartNumberingAfterBreak="0">
     <w:nsid w:val="6BF553B2"/>
     <w:multiLevelType w:val="multilevel"/>
     <w:tmpl w:val="0F36D642"/>
@@ -8240,7 +9110,7 @@
       </w:rPr>
     </w:lvl>
   </w:abstractNum>
-  <w:abstractNum w:abstractNumId="30" w15:restartNumberingAfterBreak="0">
+  <w:abstractNum w:abstractNumId="31" w15:restartNumberingAfterBreak="0">
     <w:nsid w:val="718724B8"/>
     <w:multiLevelType w:val="hybridMultilevel"/>
     <w:tmpl w:val="AADEAF0A"/>
@@ -8329,7 +9199,7 @@
       </w:pPr>
     </w:lvl>
   </w:abstractNum>
-  <w:abstractNum w:abstractNumId="31" w15:restartNumberingAfterBreak="0">
+  <w:abstractNum w:abstractNumId="32" w15:restartNumberingAfterBreak="0">
     <w:nsid w:val="74CD1FD2"/>
     <w:multiLevelType w:val="hybridMultilevel"/>
     <w:tmpl w:val="B9FED904"/>
@@ -8418,7 +9288,7 @@
       </w:pPr>
     </w:lvl>
   </w:abstractNum>
-  <w:abstractNum w:abstractNumId="32" w15:restartNumberingAfterBreak="0">
+  <w:abstractNum w:abstractNumId="33" w15:restartNumberingAfterBreak="0">
     <w:nsid w:val="77BE13EA"/>
     <w:multiLevelType w:val="multilevel"/>
     <w:tmpl w:val="25B8830C"/>
@@ -8533,7 +9403,7 @@
       </w:rPr>
     </w:lvl>
   </w:abstractNum>
-  <w:abstractNum w:abstractNumId="33" w15:restartNumberingAfterBreak="0">
+  <w:abstractNum w:abstractNumId="34" w15:restartNumberingAfterBreak="0">
     <w:nsid w:val="791738E3"/>
     <w:multiLevelType w:val="hybridMultilevel"/>
     <w:tmpl w:val="2C261002"/>
@@ -8646,7 +9516,7 @@
       </w:rPr>
     </w:lvl>
   </w:abstractNum>
-  <w:abstractNum w:abstractNumId="34" w15:restartNumberingAfterBreak="0">
+  <w:abstractNum w:abstractNumId="35" w15:restartNumberingAfterBreak="0">
     <w:nsid w:val="7F3E3829"/>
     <w:multiLevelType w:val="hybridMultilevel"/>
     <w:tmpl w:val="8A125D5C"/>
@@ -8739,34 +9609,34 @@
     <w:abstractNumId w:val="6"/>
   </w:num>
   <w:num w:numId="2">
-    <w:abstractNumId w:val="21"/>
+    <w:abstractNumId w:val="22"/>
   </w:num>
   <w:num w:numId="3">
     <w:abstractNumId w:val="2"/>
   </w:num>
   <w:num w:numId="4">
-    <w:abstractNumId w:val="23"/>
+    <w:abstractNumId w:val="24"/>
   </w:num>
   <w:num w:numId="5">
-    <w:abstractNumId w:val="25"/>
+    <w:abstractNumId w:val="26"/>
   </w:num>
   <w:num w:numId="6">
-    <w:abstractNumId w:val="29"/>
+    <w:abstractNumId w:val="30"/>
   </w:num>
   <w:num w:numId="7">
-    <w:abstractNumId w:val="28"/>
+    <w:abstractNumId w:val="29"/>
   </w:num>
   <w:num w:numId="8">
     <w:abstractNumId w:val="3"/>
   </w:num>
   <w:num w:numId="9">
-    <w:abstractNumId w:val="26"/>
+    <w:abstractNumId w:val="27"/>
   </w:num>
   <w:num w:numId="10">
     <w:abstractNumId w:val="14"/>
   </w:num>
   <w:num w:numId="11">
-    <w:abstractNumId w:val="18"/>
+    <w:abstractNumId w:val="19"/>
   </w:num>
   <w:num w:numId="12">
     <w:abstractNumId w:val="13"/>
@@ -8775,31 +9645,31 @@
     <w:abstractNumId w:val="0"/>
   </w:num>
   <w:num w:numId="14">
-    <w:abstractNumId w:val="16"/>
+    <w:abstractNumId w:val="17"/>
   </w:num>
   <w:num w:numId="15">
-    <w:abstractNumId w:val="31"/>
+    <w:abstractNumId w:val="32"/>
   </w:num>
   <w:num w:numId="16">
     <w:abstractNumId w:val="9"/>
   </w:num>
   <w:num w:numId="17">
-    <w:abstractNumId w:val="20"/>
+    <w:abstractNumId w:val="21"/>
   </w:num>
   <w:num w:numId="18">
     <w:abstractNumId w:val="15"/>
   </w:num>
   <w:num w:numId="19">
-    <w:abstractNumId w:val="32"/>
+    <w:abstractNumId w:val="33"/>
   </w:num>
   <w:num w:numId="20">
     <w:abstractNumId w:val="5"/>
   </w:num>
   <w:num w:numId="21">
-    <w:abstractNumId w:val="34"/>
+    <w:abstractNumId w:val="35"/>
   </w:num>
   <w:num w:numId="22">
-    <w:abstractNumId w:val="24"/>
+    <w:abstractNumId w:val="25"/>
   </w:num>
   <w:num w:numId="23">
     <w:abstractNumId w:val="8"/>
@@ -8811,16 +9681,16 @@
     <w:abstractNumId w:val="12"/>
   </w:num>
   <w:num w:numId="26">
-    <w:abstractNumId w:val="33"/>
+    <w:abstractNumId w:val="34"/>
   </w:num>
   <w:num w:numId="27">
-    <w:abstractNumId w:val="19"/>
+    <w:abstractNumId w:val="20"/>
   </w:num>
   <w:num w:numId="28">
-    <w:abstractNumId w:val="17"/>
+    <w:abstractNumId w:val="18"/>
   </w:num>
   <w:num w:numId="29">
-    <w:abstractNumId w:val="30"/>
+    <w:abstractNumId w:val="31"/>
   </w:num>
   <w:num w:numId="30">
     <w:abstractNumId w:val="1"/>
@@ -8829,16 +9699,19 @@
     <w:abstractNumId w:val="7"/>
   </w:num>
   <w:num w:numId="32">
-    <w:abstractNumId w:val="27"/>
+    <w:abstractNumId w:val="28"/>
   </w:num>
   <w:num w:numId="33">
-    <w:abstractNumId w:val="22"/>
+    <w:abstractNumId w:val="23"/>
   </w:num>
   <w:num w:numId="34">
     <w:abstractNumId w:val="4"/>
   </w:num>
   <w:num w:numId="35">
     <w:abstractNumId w:val="11"/>
+  </w:num>
+  <w:num w:numId="36">
+    <w:abstractNumId w:val="16"/>
   </w:num>
 </w:numbering>
 </file>
@@ -9797,7 +10670,7 @@
 </file>
 
 <file path=customXml/itemProps1.xml><?xml version="1.0" encoding="utf-8"?>
-<ds:datastoreItem xmlns:ds="http://schemas.openxmlformats.org/officeDocument/2006/customXml" ds:itemID="{6DBAA293-BCEA-43B0-B569-71DE9ACD6BF9}">
+<ds:datastoreItem xmlns:ds="http://schemas.openxmlformats.org/officeDocument/2006/customXml" ds:itemID="{7D12FD08-7E22-4BE6-B8CC-B44DBF52C6F3}">
   <ds:schemaRefs>
     <ds:schemaRef ds:uri="http://schemas.openxmlformats.org/officeDocument/2006/bibliography"/>
   </ds:schemaRefs>

</xml_diff>

<commit_message>
feat: adecuacion de extraccion robusta y salvaguardas en informes individuales y multiples
- Normalizacion de nombre de universidad completa (PUCP) en parrafos, tablas y encabezados\n- Validacion y llenado garantizado de Cuadro N 1 (Beca, Convocatoria, Carrera, IES)\n- Orden consistente de Nombres y Apellidos en informes, oficios y notificaciones\n- Fechas de inicio/fin y tabla de ciclos garantizada sin campos vacios\n- Politicas de proteccion de datos y exclusion de archivos sensibles
</commit_message>
<xml_diff>
--- a/plantillas/plantilla_informe.docx
+++ b/plantillas/plantilla_informe.docx
@@ -889,7 +889,33 @@
           <w:rFonts w:ascii="Arial" w:eastAsia="Arial" w:hAnsi="Arial" w:cs="Arial"/>
           <w:lang w:val="es-ES"/>
         </w:rPr>
-        <w:t xml:space="preserve">Decreto Supremo N° 018-2020-MINEDU, que aprueba el Reglamento de la Ley N° 29837, Ley que crea el Programa Nacional de Becas y Crédito Educativo. </w:t>
+        <w:t xml:space="preserve">Decreto </w:t>
+      </w:r>
+      <w:r>
+        <w:rPr>
+          <w:rFonts w:ascii="Arial" w:hAnsi="Arial" w:cs="Arial"/>
+        </w:rPr>
+        <w:t>Supremo N° 018-2020-MINEDU</w:t>
+      </w:r>
+      <w:r>
+        <w:rPr>
+          <w:rStyle w:val="Refdenotaalpie"/>
+          <w:rFonts w:ascii="Arial" w:hAnsi="Arial" w:cs="Arial"/>
+        </w:rPr>
+        <w:footnoteReference w:id="1"/>
+      </w:r>
+      <w:r>
+        <w:rPr>
+          <w:rFonts w:ascii="Arial" w:hAnsi="Arial" w:cs="Arial"/>
+        </w:rPr>
+        <w:t>, que aprueba el Reglamento de la Ley N° 29837, Ley que crea el Programa Nacional de Becas y Crédito Educativo; en adelante el Reglamento de la Ley N° 29837, vigente a partir del 05 de enero del 2021</w:t>
+      </w:r>
+      <w:r>
+        <w:rPr>
+          <w:rFonts w:ascii="Arial" w:eastAsia="Arial" w:hAnsi="Arial" w:cs="Arial"/>
+          <w:lang w:val="es-ES"/>
+        </w:rPr>
+        <w:t xml:space="preserve">. </w:t>
       </w:r>
     </w:p>
     <w:p>
@@ -1071,13 +1097,27 @@
         <w:rPr>
           <w:rFonts w:ascii="Arial" w:hAnsi="Arial" w:cs="Arial"/>
         </w:rPr>
-        <w:t>norma técnica denominada “Disposiciones para el becario del PRONABEC”</w:t>
+        <w:t xml:space="preserve">norma técnica denominada “Disposiciones para el becario del </w:t>
       </w:r>
       <w:r>
         <w:rPr>
           <w:rFonts w:ascii="Arial" w:hAnsi="Arial" w:cs="Arial"/>
         </w:rPr>
+        <w:lastRenderedPageBreak/>
+        <w:t>PRONABEC”</w:t>
+      </w:r>
+      <w:r>
+        <w:rPr>
+          <w:rFonts w:ascii="Arial" w:hAnsi="Arial" w:cs="Arial"/>
+        </w:rPr>
         <w:t xml:space="preserve"> versión 02</w:t>
+      </w:r>
+      <w:r>
+        <w:rPr>
+          <w:rStyle w:val="Refdenotaalpie"/>
+          <w:rFonts w:ascii="Arial" w:hAnsi="Arial" w:cs="Arial"/>
+        </w:rPr>
+        <w:footnoteReference w:id="2"/>
       </w:r>
       <w:r>
         <w:rPr>
@@ -1227,15 +1267,7 @@
           <w:sz w:val="22"/>
           <w:szCs w:val="22"/>
         </w:rPr>
-        <w:t xml:space="preserve">solicitud de ampliación </w:t>
-      </w:r>
-      <w:r>
-        <w:rPr>
-          <w:sz w:val="22"/>
-          <w:szCs w:val="22"/>
-        </w:rPr>
-        <w:lastRenderedPageBreak/>
-        <w:t xml:space="preserve">excepcional de la duración del periodo de estudios </w:t>
+        <w:t xml:space="preserve">solicitud de ampliación excepcional de la duración del periodo de estudios </w:t>
       </w:r>
       <w:r>
         <w:rPr>
@@ -2191,15 +2223,7 @@
           <w:sz w:val="22"/>
           <w:szCs w:val="22"/>
         </w:rPr>
-        <w:t>está sujeta a la disponibilidad presupuestal</w:t>
-      </w:r>
-      <w:r>
-        <w:rPr>
-          <w:i/>
-          <w:sz w:val="22"/>
-          <w:szCs w:val="22"/>
-        </w:rPr>
-        <w:t xml:space="preserve">, se debe efectuar en el período académico inmediato posterior al término del período de estudios programado </w:t>
+        <w:t xml:space="preserve">está sujeta a la disponibilidad </w:t>
       </w:r>
       <w:r>
         <w:rPr>
@@ -2209,6 +2233,25 @@
           <w:sz w:val="22"/>
           <w:szCs w:val="22"/>
         </w:rPr>
+        <w:lastRenderedPageBreak/>
+        <w:t>presupuestal</w:t>
+      </w:r>
+      <w:r>
+        <w:rPr>
+          <w:i/>
+          <w:sz w:val="22"/>
+          <w:szCs w:val="22"/>
+        </w:rPr>
+        <w:t xml:space="preserve">, se debe efectuar en el período académico inmediato posterior al término del período de estudios programado </w:t>
+      </w:r>
+      <w:r>
+        <w:rPr>
+          <w:b/>
+          <w:bCs/>
+          <w:i/>
+          <w:sz w:val="22"/>
+          <w:szCs w:val="22"/>
+        </w:rPr>
         <w:t>y debe ser suficiente para culminar la carrera o programa de estudios</w:t>
       </w:r>
       <w:r>
@@ -2315,17 +2358,7 @@
           <w:sz w:val="22"/>
           <w:szCs w:val="22"/>
         </w:rPr>
-        <w:t xml:space="preserve">La DIBEC, a través de la SUS, evalúa cada caso y emite el informe correspondiente. El resultado de dicha evaluación es comunicado al solicitante mediante oficio emitido por la DIBEC, la cual tramita ante la OAGD </w:t>
-      </w:r>
-      <w:r>
-        <w:rPr>
-          <w:i/>
-          <w:iCs/>
-          <w:sz w:val="22"/>
-          <w:szCs w:val="22"/>
-        </w:rPr>
-        <w:lastRenderedPageBreak/>
-        <w:t>la notificación correspondiente, con copia a la SUCCOR para su conocimiento. Cuando la evaluación resulte favorable, la comunicación también se remite a la OAF para los fines correspondientes</w:t>
+        <w:t>La DIBEC, a través de la SUS, evalúa cada caso y emite el informe correspondiente. El resultado de dicha evaluación es comunicado al solicitante mediante oficio emitido por la DIBEC, la cual tramita ante la OAGD la notificación correspondiente, con copia a la SUCCOR para su conocimiento. Cuando la evaluación resulte favorable, la comunicación también se remite a la OAF para los fines correspondientes</w:t>
       </w:r>
       <w:r>
         <w:rPr>
@@ -2720,7 +2753,7 @@
           <w:sz w:val="22"/>
           <w:szCs w:val="22"/>
         </w:rPr>
-        <w:t xml:space="preserve">“el becario presenta la solicitud de ampliación excepcional de un (1) periodo de estudios, por </w:t>
+        <w:t>“</w:t>
       </w:r>
       <w:r>
         <w:rPr>
@@ -2728,15 +2761,16 @@
           <w:sz w:val="22"/>
           <w:szCs w:val="22"/>
         </w:rPr>
-        <w:t>M</w:t>
-      </w:r>
-      <w:r>
-        <w:rPr>
+        <w:t xml:space="preserve">El becario presenta la solicitud de ampliación excepcional de un (1) período de estudios, por Mesa de Partes del PRONABEC al culminar su último período programado en el SIBEC </w:t>
+      </w:r>
+      <w:r>
+        <w:rPr>
+          <w:bCs/>
           <w:i/>
           <w:sz w:val="22"/>
           <w:szCs w:val="22"/>
         </w:rPr>
-        <w:t xml:space="preserve">esa de </w:t>
+        <w:t>y antes de la matrícula e inicio del período académico a ampliar</w:t>
       </w:r>
       <w:r>
         <w:rPr>
@@ -2744,15 +2778,16 @@
           <w:sz w:val="22"/>
           <w:szCs w:val="22"/>
         </w:rPr>
-        <w:t>P</w:t>
-      </w:r>
-      <w:r>
-        <w:rPr>
+        <w:t xml:space="preserve">, adjuntando la documentación que acredite que aún no ha culminado la carrera o programa de estudios y que precise los cursos pendientes que tiene el becario. La ampliación excepcional se otorga por un (1) período académico adicional, </w:t>
+      </w:r>
+      <w:r>
+        <w:rPr>
+          <w:bCs/>
           <w:i/>
           <w:sz w:val="22"/>
           <w:szCs w:val="22"/>
         </w:rPr>
-        <w:t>artes del PRONABEC al culminar su último periodo programado en el SIBEC</w:t>
+        <w:t>está sujeta a la disponibilidad presupuestal</w:t>
       </w:r>
       <w:r>
         <w:rPr>
@@ -2760,15 +2795,16 @@
           <w:sz w:val="22"/>
           <w:szCs w:val="22"/>
         </w:rPr>
-        <w:t xml:space="preserve"> y antes de la matricula e inicio del periodo académico a ampliar</w:t>
-      </w:r>
-      <w:r>
-        <w:rPr>
+        <w:t xml:space="preserve">, se debe efectuar en el período académico inmediato posterior al término del período de estudios programado </w:t>
+      </w:r>
+      <w:r>
+        <w:rPr>
+          <w:bCs/>
           <w:i/>
           <w:sz w:val="22"/>
           <w:szCs w:val="22"/>
         </w:rPr>
-        <w:t xml:space="preserve">, adjuntando la documentación que acredite que aún no ha culminado </w:t>
+        <w:t>y debe ser suficiente para culminar la carrera o programa de estudios</w:t>
       </w:r>
       <w:r>
         <w:rPr>
@@ -2776,15 +2812,7 @@
           <w:sz w:val="22"/>
           <w:szCs w:val="22"/>
         </w:rPr>
-        <w:t>la carrera o programa de</w:t>
-      </w:r>
-      <w:r>
-        <w:rPr>
-          <w:i/>
-          <w:sz w:val="22"/>
-          <w:szCs w:val="22"/>
-        </w:rPr>
-        <w:t xml:space="preserve"> estudios y que precise los cursos pendientes que tiene el becario”</w:t>
+        <w:t>”</w:t>
       </w:r>
       <w:r>
         <w:rPr>
@@ -2832,276 +2860,14 @@
           <w:sz w:val="22"/>
           <w:szCs w:val="22"/>
         </w:rPr>
-        <w:t xml:space="preserve">Por lo </w:t>
-      </w:r>
-      <w:r>
-        <w:rPr>
-          <w:sz w:val="22"/>
-          <w:szCs w:val="22"/>
-        </w:rPr>
-        <w:t>tanto, se deslinda que la</w:t>
-      </w:r>
-      <w:r>
-        <w:rPr>
-          <w:sz w:val="22"/>
-          <w:szCs w:val="22"/>
-        </w:rPr>
-        <w:t xml:space="preserve"> citada norma </w:t>
-      </w:r>
-      <w:r>
-        <w:rPr>
-          <w:sz w:val="22"/>
-          <w:szCs w:val="22"/>
-        </w:rPr>
-        <w:t>precisa</w:t>
-      </w:r>
-      <w:r>
-        <w:rPr>
-          <w:sz w:val="22"/>
-          <w:szCs w:val="22"/>
-        </w:rPr>
-        <w:t xml:space="preserve"> </w:t>
-      </w:r>
-      <w:r>
-        <w:rPr>
-          <w:sz w:val="22"/>
-          <w:szCs w:val="22"/>
-        </w:rPr>
-        <w:t>3</w:t>
-      </w:r>
-      <w:r>
-        <w:rPr>
-          <w:sz w:val="22"/>
-          <w:szCs w:val="22"/>
-        </w:rPr>
-        <w:t xml:space="preserve"> </w:t>
-      </w:r>
-      <w:r>
-        <w:rPr>
-          <w:sz w:val="22"/>
-          <w:szCs w:val="22"/>
-        </w:rPr>
-        <w:t xml:space="preserve">puntos a tomar en cuenta para la evaluación de la </w:t>
-      </w:r>
-      <w:r>
-        <w:rPr>
-          <w:sz w:val="22"/>
-          <w:szCs w:val="22"/>
-        </w:rPr>
-        <w:t xml:space="preserve">ampliación excepcional de la duración del periodo de estudios: </w:t>
-      </w:r>
-    </w:p>
-    <w:p>
-      <w:pPr>
-        <w:pStyle w:val="Default"/>
-        <w:jc w:val="both"/>
-        <w:rPr>
-          <w:sz w:val="22"/>
-          <w:szCs w:val="22"/>
-        </w:rPr>
-      </w:pPr>
-    </w:p>
-    <w:p>
-      <w:pPr>
-        <w:pStyle w:val="Default"/>
-        <w:numPr>
-          <w:ilvl w:val="0"/>
-          <w:numId w:val="36"/>
-        </w:numPr>
-        <w:jc w:val="both"/>
-        <w:rPr>
-          <w:sz w:val="22"/>
-          <w:szCs w:val="22"/>
-        </w:rPr>
-      </w:pPr>
-      <w:r>
-        <w:rPr>
-          <w:sz w:val="22"/>
-          <w:szCs w:val="22"/>
-        </w:rPr>
-        <w:t>E</w:t>
-      </w:r>
-      <w:r>
-        <w:rPr>
-          <w:sz w:val="22"/>
-          <w:szCs w:val="22"/>
-        </w:rPr>
-        <w:t>l plazo de presentación</w:t>
-      </w:r>
-      <w:r>
-        <w:rPr>
-          <w:sz w:val="22"/>
-          <w:szCs w:val="22"/>
-        </w:rPr>
-        <w:t>.</w:t>
-      </w:r>
-    </w:p>
-    <w:p>
-      <w:pPr>
-        <w:pStyle w:val="Default"/>
-        <w:numPr>
-          <w:ilvl w:val="0"/>
-          <w:numId w:val="36"/>
-        </w:numPr>
-        <w:jc w:val="both"/>
-        <w:rPr>
-          <w:sz w:val="22"/>
-          <w:szCs w:val="22"/>
-        </w:rPr>
-      </w:pPr>
-      <w:r>
-        <w:rPr>
-          <w:sz w:val="22"/>
-          <w:szCs w:val="22"/>
-        </w:rPr>
-        <w:t>L</w:t>
-      </w:r>
-      <w:r>
-        <w:rPr>
-          <w:sz w:val="22"/>
-          <w:szCs w:val="22"/>
-        </w:rPr>
-        <w:t>os</w:t>
-      </w:r>
-      <w:r>
-        <w:rPr>
-          <w:sz w:val="22"/>
-          <w:szCs w:val="22"/>
-        </w:rPr>
-        <w:t xml:space="preserve"> </w:t>
-      </w:r>
-      <w:r>
-        <w:rPr>
-          <w:sz w:val="22"/>
-          <w:szCs w:val="22"/>
-        </w:rPr>
-        <w:t xml:space="preserve">documentos académicos a presentar para acreditar </w:t>
-      </w:r>
-      <w:r>
-        <w:rPr>
-          <w:sz w:val="22"/>
-          <w:szCs w:val="22"/>
-        </w:rPr>
-        <w:t xml:space="preserve">que </w:t>
-      </w:r>
-      <w:r>
-        <w:rPr>
-          <w:sz w:val="22"/>
-          <w:szCs w:val="22"/>
-        </w:rPr>
-        <w:t>aún no se ha culminado la carrera</w:t>
-      </w:r>
-      <w:r>
-        <w:rPr>
-          <w:sz w:val="22"/>
-          <w:szCs w:val="22"/>
-        </w:rPr>
-        <w:t xml:space="preserve"> (con</w:t>
-      </w:r>
-      <w:r>
-        <w:rPr>
-          <w:sz w:val="22"/>
-          <w:szCs w:val="22"/>
-        </w:rPr>
-        <w:t xml:space="preserve"> los cursos pendientes que tiene el becario</w:t>
-      </w:r>
-      <w:r>
-        <w:rPr>
-          <w:sz w:val="22"/>
-          <w:szCs w:val="22"/>
-        </w:rPr>
-        <w:t>).</w:t>
-      </w:r>
-    </w:p>
-    <w:p>
-      <w:pPr>
-        <w:pStyle w:val="Default"/>
-        <w:numPr>
-          <w:ilvl w:val="0"/>
-          <w:numId w:val="36"/>
-        </w:numPr>
-        <w:jc w:val="both"/>
-        <w:rPr>
-          <w:sz w:val="22"/>
-          <w:szCs w:val="22"/>
-        </w:rPr>
-      </w:pPr>
-      <w:r>
-        <w:rPr>
-          <w:sz w:val="22"/>
-          <w:szCs w:val="22"/>
-        </w:rPr>
-        <w:t>L</w:t>
-      </w:r>
-      <w:r>
-        <w:rPr>
-          <w:sz w:val="22"/>
-          <w:szCs w:val="22"/>
-        </w:rPr>
-        <w:t>os curso</w:t>
-      </w:r>
-      <w:r>
-        <w:rPr>
-          <w:sz w:val="22"/>
-          <w:szCs w:val="22"/>
-        </w:rPr>
-        <w:t>s</w:t>
-      </w:r>
-      <w:r>
-        <w:rPr>
-          <w:sz w:val="22"/>
-          <w:szCs w:val="22"/>
-        </w:rPr>
-        <w:t xml:space="preserve"> pendiente</w:t>
-      </w:r>
-      <w:r>
-        <w:rPr>
-          <w:sz w:val="22"/>
-          <w:szCs w:val="22"/>
-        </w:rPr>
-        <w:t xml:space="preserve">s </w:t>
-      </w:r>
-      <w:r>
-        <w:rPr>
-          <w:sz w:val="22"/>
-          <w:szCs w:val="22"/>
-        </w:rPr>
-        <w:t xml:space="preserve">deben ser suficientes para culminar la carrera o programa de estudios </w:t>
-      </w:r>
-      <w:r>
-        <w:rPr>
-          <w:sz w:val="22"/>
-          <w:szCs w:val="22"/>
-        </w:rPr>
-        <w:t xml:space="preserve">y </w:t>
-      </w:r>
-      <w:r>
-        <w:rPr>
-          <w:sz w:val="22"/>
-          <w:szCs w:val="22"/>
-        </w:rPr>
-        <w:t>deben efectuar</w:t>
-      </w:r>
-      <w:r>
-        <w:rPr>
-          <w:sz w:val="22"/>
-          <w:szCs w:val="22"/>
-        </w:rPr>
-        <w:t>se</w:t>
-      </w:r>
-      <w:r>
-        <w:rPr>
-          <w:sz w:val="22"/>
-          <w:szCs w:val="22"/>
-        </w:rPr>
-        <w:t xml:space="preserve"> en el periodo académico inmediato posterior al término del periodo de estudios programado</w:t>
-      </w:r>
-      <w:r>
-        <w:rPr>
-          <w:sz w:val="22"/>
-          <w:szCs w:val="22"/>
-        </w:rPr>
-        <w:t xml:space="preserve">. </w:t>
+        <w:t>Respecto al plazo de presentación, de la revisión de la documentación presentada, l</w:t>
+      </w:r>
+      <w:r>
+        <w:rPr>
+          <w:sz w:val="22"/>
+          <w:szCs w:val="22"/>
+        </w:rPr>
+        <w:t>a solicitud {{ DEL_BECARIO_A }} fue ingresada por mesa de partes el {{ FECHA_SOLICITUD_TEXTO }}, por lo tanto, se verifica que fue presentado antes de la matrícula e inicio del periodo académico a ampliar.</w:t>
       </w:r>
     </w:p>
     <w:p>
@@ -3125,42 +2891,189 @@
         <w:ind w:left="567"/>
         <w:jc w:val="both"/>
         <w:rPr>
-          <w:sz w:val="22"/>
-          <w:szCs w:val="22"/>
-        </w:rPr>
-      </w:pPr>
-      <w:r>
-        <w:rPr>
-          <w:sz w:val="22"/>
-          <w:szCs w:val="22"/>
-        </w:rPr>
-        <w:t xml:space="preserve">Respecto al plazo de presentación, de la revisión de la documentación presentada, </w:t>
-      </w:r>
-      <w:bookmarkStart w:id="4" w:name="_GoBack"/>
-      <w:bookmarkEnd w:id="4"/>
-      <w:r>
-        <w:rPr>
-          <w:sz w:val="22"/>
-          <w:szCs w:val="22"/>
-        </w:rPr>
-        <w:t>l</w:t>
-      </w:r>
-      <w:r>
-        <w:rPr>
-          <w:sz w:val="22"/>
-          <w:szCs w:val="22"/>
-        </w:rPr>
-        <w:t>a solicitud {{ DEL_BECARIO_A }} fue ingresada por mesa de partes el {{ FECHA_SOLICITUD_TEXTO }}, por lo tanto, se verifica que fue presentado antes de la matrícula e inicio del periodo académico a ampliar.</w:t>
+          <w:i/>
+          <w:sz w:val="22"/>
+          <w:szCs w:val="22"/>
+        </w:rPr>
+      </w:pPr>
+      <w:r>
+        <w:rPr>
+          <w:sz w:val="22"/>
+          <w:szCs w:val="22"/>
+        </w:rPr>
+        <w:t xml:space="preserve">Respecto a los </w:t>
+      </w:r>
+      <w:r>
+        <w:rPr>
+          <w:sz w:val="22"/>
+          <w:szCs w:val="22"/>
+        </w:rPr>
+        <w:t xml:space="preserve">documentos académicos a presentar para acreditar </w:t>
+      </w:r>
+      <w:r>
+        <w:rPr>
+          <w:sz w:val="22"/>
+          <w:szCs w:val="22"/>
+        </w:rPr>
+        <w:t xml:space="preserve">que </w:t>
+      </w:r>
+      <w:r>
+        <w:rPr>
+          <w:sz w:val="22"/>
+          <w:szCs w:val="22"/>
+        </w:rPr>
+        <w:t>aún no se ha culminado la carrera</w:t>
+      </w:r>
+      <w:r>
+        <w:rPr>
+          <w:sz w:val="22"/>
+          <w:szCs w:val="22"/>
+        </w:rPr>
+        <w:t xml:space="preserve">, se revisó la información de los cursos pendientes informados por </w:t>
+      </w:r>
+      <w:proofErr w:type="gramStart"/>
+      <w:r>
+        <w:rPr>
+          <w:sz w:val="22"/>
+          <w:szCs w:val="22"/>
+        </w:rPr>
+        <w:t>{{ DEL</w:t>
+      </w:r>
+      <w:proofErr w:type="gramEnd"/>
+      <w:r>
+        <w:rPr>
+          <w:sz w:val="22"/>
+          <w:szCs w:val="22"/>
+        </w:rPr>
+        <w:t xml:space="preserve">_BECARIO_A }} </w:t>
+      </w:r>
+      <w:r>
+        <w:rPr>
+          <w:sz w:val="22"/>
+          <w:szCs w:val="22"/>
+        </w:rPr>
+        <w:t>en su solicitud y la información remitida m</w:t>
+      </w:r>
+      <w:r>
+        <w:rPr>
+          <w:sz w:val="22"/>
+          <w:szCs w:val="22"/>
+        </w:rPr>
+        <w:t xml:space="preserve">ediante {{ CODIGO_DOC_IES }}, de fecha {{ FECHA_DOC_IES_TEXTO }}, </w:t>
+      </w:r>
+      <w:r>
+        <w:rPr>
+          <w:sz w:val="22"/>
+          <w:szCs w:val="22"/>
+        </w:rPr>
+        <w:t xml:space="preserve">en la cual </w:t>
+      </w:r>
+      <w:r>
+        <w:rPr>
+          <w:sz w:val="22"/>
+          <w:szCs w:val="22"/>
+        </w:rPr>
+        <w:t xml:space="preserve">la {{ INSTITUCION }} remite la relación de cursos que tiene pendiente {{ EL_LA_BECARIO_A }} {{ NOMBRE_PRIMERO_NOMBRES }} al finalizar el semestre {{ SEMESTRE_ANTERIOR }}. De la revisión de dicho documento se observa que </w:t>
+      </w:r>
+      <w:proofErr w:type="gramStart"/>
+      <w:r>
+        <w:rPr>
+          <w:sz w:val="22"/>
+          <w:szCs w:val="22"/>
+        </w:rPr>
+        <w:t>{{ EL</w:t>
+      </w:r>
+      <w:proofErr w:type="gramEnd"/>
+      <w:r>
+        <w:rPr>
+          <w:sz w:val="22"/>
+          <w:szCs w:val="22"/>
+        </w:rPr>
+        <w:t xml:space="preserve">_LA_BECARIO_A }} tiene cursos pendientes, los cuales </w:t>
+      </w:r>
+      <w:r>
+        <w:rPr>
+          <w:sz w:val="22"/>
+          <w:szCs w:val="22"/>
+        </w:rPr>
+        <w:lastRenderedPageBreak/>
+        <w:t>acreditan que aún no ha culminado sus estudios y que dichos cursos pueden cursarse en un periodo académico adicional, en este caso, en el semestre {{ SEMESTRE_SOLICITADO }}.</w:t>
       </w:r>
     </w:p>
     <w:p>
       <w:pPr>
-        <w:pStyle w:val="Default"/>
+        <w:pStyle w:val="Prrafodelista"/>
+        <w:spacing w:after="0"/>
         <w:ind w:left="567"/>
-        <w:jc w:val="both"/>
-        <w:rPr>
-          <w:sz w:val="22"/>
-          <w:szCs w:val="22"/>
+        <w:rPr>
+          <w:rFonts w:ascii="Arial" w:hAnsi="Arial" w:cs="Arial"/>
+          <w:sz w:val="20"/>
+          <w:szCs w:val="20"/>
+        </w:rPr>
+      </w:pPr>
+    </w:p>
+    <w:p>
+      <w:pPr>
+        <w:pStyle w:val="Prrafodelista"/>
+        <w:spacing w:after="0"/>
+        <w:ind w:left="567"/>
+        <w:rPr>
+          <w:rFonts w:ascii="Arial" w:hAnsi="Arial" w:cs="Arial"/>
+          <w:u w:val="single"/>
+        </w:rPr>
+      </w:pPr>
+      <w:r>
+        <w:rPr>
+          <w:rFonts w:ascii="Arial" w:hAnsi="Arial" w:cs="Arial"/>
+          <w:u w:val="single"/>
+        </w:rPr>
+        <w:t xml:space="preserve">Listado de cursos pendientes que tiene </w:t>
+      </w:r>
+      <w:proofErr w:type="gramStart"/>
+      <w:r>
+        <w:rPr>
+          <w:rFonts w:ascii="Arial" w:hAnsi="Arial" w:cs="Arial"/>
+          <w:u w:val="single"/>
+        </w:rPr>
+        <w:t>{{ EL</w:t>
+      </w:r>
+      <w:proofErr w:type="gramEnd"/>
+      <w:r>
+        <w:rPr>
+          <w:rFonts w:ascii="Arial" w:hAnsi="Arial" w:cs="Arial"/>
+          <w:u w:val="single"/>
+        </w:rPr>
+        <w:t>_LA_BECARIO_A }}:</w:t>
+      </w:r>
+    </w:p>
+    <w:p>
+      <w:pPr>
+        <w:spacing w:after="0"/>
+        <w:ind w:firstLine="567"/>
+        <w:rPr>
+          <w:rFonts w:ascii="Arial" w:hAnsi="Arial" w:cs="Arial"/>
+        </w:rPr>
+      </w:pPr>
+      <w:proofErr w:type="gramStart"/>
+      <w:r>
+        <w:rPr>
+          <w:rFonts w:ascii="Arial" w:hAnsi="Arial" w:cs="Arial"/>
+        </w:rPr>
+        <w:t>{{ CURSOS</w:t>
+      </w:r>
+      <w:proofErr w:type="gramEnd"/>
+      <w:r>
+        <w:rPr>
+          <w:rFonts w:ascii="Arial" w:hAnsi="Arial" w:cs="Arial"/>
+        </w:rPr>
+        <w:t>_PENDIENTES }}</w:t>
+      </w:r>
+    </w:p>
+    <w:p>
+      <w:pPr>
+        <w:spacing w:after="0"/>
+        <w:rPr>
+          <w:rFonts w:ascii="Arial" w:hAnsi="Arial" w:cs="Arial"/>
         </w:rPr>
       </w:pPr>
     </w:p>
@@ -3174,45 +3087,16 @@
         <w:ind w:left="567"/>
         <w:jc w:val="both"/>
         <w:rPr>
-          <w:i/>
-          <w:sz w:val="22"/>
-          <w:szCs w:val="22"/>
-        </w:rPr>
-      </w:pPr>
-      <w:r>
-        <w:rPr>
-          <w:sz w:val="22"/>
-          <w:szCs w:val="22"/>
-        </w:rPr>
-        <w:t xml:space="preserve">Respecto a los </w:t>
-      </w:r>
-      <w:r>
-        <w:rPr>
-          <w:sz w:val="22"/>
-          <w:szCs w:val="22"/>
-        </w:rPr>
-        <w:t xml:space="preserve">documentos académicos a presentar para acreditar </w:t>
-      </w:r>
-      <w:r>
-        <w:rPr>
-          <w:sz w:val="22"/>
-          <w:szCs w:val="22"/>
-        </w:rPr>
-        <w:t xml:space="preserve">que </w:t>
-      </w:r>
-      <w:r>
-        <w:rPr>
-          <w:sz w:val="22"/>
-          <w:szCs w:val="22"/>
-        </w:rPr>
-        <w:t>aún no se ha culminado la carrera</w:t>
-      </w:r>
-      <w:r>
-        <w:rPr>
-          <w:sz w:val="22"/>
-          <w:szCs w:val="22"/>
-        </w:rPr>
-        <w:t xml:space="preserve">, se revisó la información de los cursos pendientes informados por </w:t>
+          <w:sz w:val="22"/>
+          <w:szCs w:val="22"/>
+        </w:rPr>
+      </w:pPr>
+      <w:r>
+        <w:rPr>
+          <w:sz w:val="22"/>
+          <w:szCs w:val="22"/>
+        </w:rPr>
+        <w:t xml:space="preserve">Respecto a que los cursos pendientes deben ser suficientes para culminar la carrera o programa de estudios y deben efectuarse en el periodo académico inmediato posterior al término del periodo de estudios programado, el documento de la IES informa que con dichos cursos </w:t>
       </w:r>
       <w:proofErr w:type="gramStart"/>
       <w:r>
@@ -3220,7 +3104,7 @@
           <w:sz w:val="22"/>
           <w:szCs w:val="22"/>
         </w:rPr>
-        <w:t>{{ DEL</w:t>
+        <w:t>{{ EL</w:t>
       </w:r>
       <w:proofErr w:type="gramEnd"/>
       <w:r>
@@ -3228,180 +3112,12 @@
           <w:sz w:val="22"/>
           <w:szCs w:val="22"/>
         </w:rPr>
-        <w:t xml:space="preserve">_BECARIO_A }} </w:t>
-      </w:r>
-      <w:r>
-        <w:rPr>
-          <w:sz w:val="22"/>
-          <w:szCs w:val="22"/>
-        </w:rPr>
-        <w:t>en su solicitud y la información remitida m</w:t>
-      </w:r>
-      <w:r>
-        <w:rPr>
-          <w:sz w:val="22"/>
-          <w:szCs w:val="22"/>
-        </w:rPr>
-        <w:t xml:space="preserve">ediante {{ CODIGO_DOC_IES }}, de fecha {{ FECHA_DOC_IES_TEXTO }}, </w:t>
-      </w:r>
-      <w:r>
-        <w:rPr>
-          <w:sz w:val="22"/>
-          <w:szCs w:val="22"/>
-        </w:rPr>
-        <w:t xml:space="preserve">en la cual </w:t>
-      </w:r>
-      <w:r>
-        <w:rPr>
-          <w:sz w:val="22"/>
-          <w:szCs w:val="22"/>
-        </w:rPr>
-        <w:t xml:space="preserve">la {{ INSTITUCION }} remite la relación de cursos que tiene pendiente {{ EL_LA_BECARIO_A }} {{ NOMBRE_PRIMERO_NOMBRES }} al finalizar el semestre {{ SEMESTRE_ANTERIOR }}. De la revisión de dicho documento se observa que </w:t>
-      </w:r>
-      <w:proofErr w:type="gramStart"/>
-      <w:r>
-        <w:rPr>
-          <w:sz w:val="22"/>
-          <w:szCs w:val="22"/>
-        </w:rPr>
-        <w:t>{{ EL</w:t>
-      </w:r>
-      <w:proofErr w:type="gramEnd"/>
-      <w:r>
-        <w:rPr>
-          <w:sz w:val="22"/>
-          <w:szCs w:val="22"/>
-        </w:rPr>
-        <w:t xml:space="preserve">_LA_BECARIO_A }} tiene cursos pendientes, los cuales acreditan que aún no ha culminado sus estudios y que dichos cursos pueden </w:t>
-      </w:r>
-      <w:r>
-        <w:rPr>
-          <w:sz w:val="22"/>
-          <w:szCs w:val="22"/>
-        </w:rPr>
-        <w:lastRenderedPageBreak/>
-        <w:t>cursarse en un periodo académico adicional, en este caso, en el semestre {{ SEMESTRE_SOLICITADO }}.</w:t>
-      </w:r>
-    </w:p>
-    <w:p>
-      <w:pPr>
-        <w:pStyle w:val="Prrafodelista"/>
-        <w:spacing w:after="0"/>
-        <w:ind w:left="567"/>
-        <w:rPr>
-          <w:rFonts w:ascii="Arial" w:hAnsi="Arial" w:cs="Arial"/>
-          <w:sz w:val="20"/>
-          <w:szCs w:val="20"/>
-        </w:rPr>
-      </w:pPr>
-    </w:p>
-    <w:p>
-      <w:pPr>
-        <w:pStyle w:val="Prrafodelista"/>
-        <w:spacing w:after="0"/>
-        <w:ind w:left="567"/>
-        <w:rPr>
-          <w:rFonts w:ascii="Arial" w:hAnsi="Arial" w:cs="Arial"/>
-          <w:u w:val="single"/>
-        </w:rPr>
-      </w:pPr>
-      <w:r>
-        <w:rPr>
-          <w:rFonts w:ascii="Arial" w:hAnsi="Arial" w:cs="Arial"/>
-          <w:u w:val="single"/>
-        </w:rPr>
-        <w:t xml:space="preserve">Listado de cursos pendientes que tiene </w:t>
-      </w:r>
-      <w:proofErr w:type="gramStart"/>
-      <w:r>
-        <w:rPr>
-          <w:rFonts w:ascii="Arial" w:hAnsi="Arial" w:cs="Arial"/>
-          <w:u w:val="single"/>
-        </w:rPr>
-        <w:t>{{ EL</w:t>
-      </w:r>
-      <w:proofErr w:type="gramEnd"/>
-      <w:r>
-        <w:rPr>
-          <w:rFonts w:ascii="Arial" w:hAnsi="Arial" w:cs="Arial"/>
-          <w:u w:val="single"/>
-        </w:rPr>
-        <w:t>_LA_BECARIO_A }}:</w:t>
-      </w:r>
-    </w:p>
-    <w:p>
-      <w:pPr>
-        <w:spacing w:after="0"/>
-        <w:ind w:firstLine="567"/>
-        <w:rPr>
-          <w:rFonts w:ascii="Arial" w:hAnsi="Arial" w:cs="Arial"/>
-        </w:rPr>
-      </w:pPr>
-      <w:proofErr w:type="gramStart"/>
-      <w:r>
-        <w:rPr>
-          <w:rFonts w:ascii="Arial" w:hAnsi="Arial" w:cs="Arial"/>
-        </w:rPr>
-        <w:t>{{ CURSOS</w:t>
-      </w:r>
-      <w:proofErr w:type="gramEnd"/>
-      <w:r>
-        <w:rPr>
-          <w:rFonts w:ascii="Arial" w:hAnsi="Arial" w:cs="Arial"/>
-        </w:rPr>
-        <w:t>_PENDIENTES }}</w:t>
-      </w:r>
-    </w:p>
-    <w:p>
-      <w:pPr>
-        <w:spacing w:after="0"/>
-        <w:rPr>
-          <w:rFonts w:ascii="Arial" w:hAnsi="Arial" w:cs="Arial"/>
-        </w:rPr>
-      </w:pPr>
-    </w:p>
-    <w:p>
-      <w:pPr>
-        <w:pStyle w:val="Default"/>
-        <w:numPr>
-          <w:ilvl w:val="1"/>
-          <w:numId w:val="11"/>
-        </w:numPr>
-        <w:ind w:left="567"/>
-        <w:jc w:val="both"/>
-        <w:rPr>
-          <w:sz w:val="22"/>
-          <w:szCs w:val="22"/>
-        </w:rPr>
-      </w:pPr>
-      <w:r>
-        <w:rPr>
-          <w:sz w:val="22"/>
-          <w:szCs w:val="22"/>
-        </w:rPr>
-        <w:t xml:space="preserve">Respecto a que los cursos pendientes deben ser suficientes para culminar la carrera o programa de estudios y deben efectuarse en el periodo académico inmediato posterior al término del periodo de estudios programado, el documento de la IES informa que con dichos cursos </w:t>
-      </w:r>
-      <w:proofErr w:type="gramStart"/>
-      <w:r>
-        <w:rPr>
-          <w:sz w:val="22"/>
-          <w:szCs w:val="22"/>
-        </w:rPr>
-        <w:t>{{ EL</w:t>
-      </w:r>
-      <w:proofErr w:type="gramEnd"/>
-      <w:r>
-        <w:rPr>
-          <w:sz w:val="22"/>
-          <w:szCs w:val="22"/>
-        </w:rPr>
         <w:t>_LA_BECARIO_A }}</w:t>
       </w:r>
       <w:r>
         <w:rPr>
           <w:sz w:val="22"/>
           <w:szCs w:val="22"/>
-          <w:u w:val="single"/>
         </w:rPr>
         <w:t xml:space="preserve"> </w:t>
       </w:r>
@@ -4566,14 +4282,14 @@
         <w:rPr>
           <w:rFonts w:ascii="Arial" w:hAnsi="Arial" w:cs="Arial"/>
         </w:rPr>
-        <w:t xml:space="preserve">_INFORME_SUCCOR }} se concluye que {{ EL_LA_BECARIO_A }} {{ NOMBRE_PRIMERO_NOMBRES }} cumple con los supuestos establecidos en el literal a) del artículo 30 del Reglamento de la Ley Nº 29837 y las Disposiciones para el becario del PRONABEC, por lo tanto, resulta </w:t>
+        <w:t xml:space="preserve">_INFORME_SUCCOR }} se concluye que {{ EL_LA_BECARIO_A }} {{ NOMBRE_PRIMERO_NOMBRES }} cumple con los supuestos establecidos en el literal a) del artículo 30 del Reglamento de la Ley Nº </w:t>
       </w:r>
       <w:r>
         <w:rPr>
           <w:rFonts w:ascii="Arial" w:hAnsi="Arial" w:cs="Arial"/>
         </w:rPr>
         <w:lastRenderedPageBreak/>
-        <w:t>viable la ampliación excepcional de la duración del periodo de estudios por el semestre {{ SEMESTRE_SOLICITADO }}.</w:t>
+        <w:t>29837 y las Disposiciones para el becario del PRONABEC, por lo tanto, resulta viable la ampliación excepcional de la duración del periodo de estudios por el semestre {{ SEMESTRE_SOLICITADO }}.</w:t>
       </w:r>
     </w:p>
     <w:p>
@@ -4794,6 +4510,21 @@
           <w:lang w:val="es-ES"/>
         </w:rPr>
       </w:pPr>
+    </w:p>
+    <w:p>
+      <w:pPr>
+        <w:widowControl w:val="0"/>
+        <w:autoSpaceDE w:val="0"/>
+        <w:autoSpaceDN w:val="0"/>
+        <w:spacing w:after="0" w:line="240" w:lineRule="auto"/>
+        <w:rPr>
+          <w:rFonts w:ascii="Arial" w:eastAsia="Arial" w:hAnsi="Arial" w:cs="Arial"/>
+          <w:bCs/>
+          <w:lang w:val="es-ES"/>
+        </w:rPr>
+      </w:pPr>
+      <w:bookmarkStart w:id="4" w:name="_GoBack"/>
+      <w:bookmarkEnd w:id="4"/>
     </w:p>
     <w:p>
       <w:pPr>
@@ -5689,6 +5420,149 @@
       </w:pPr>
       <w:r>
         <w:continuationSeparator/>
+      </w:r>
+    </w:p>
+  </w:footnote>
+  <w:footnote w:id="1">
+    <w:p>
+      <w:pPr>
+        <w:pStyle w:val="Textonotapie"/>
+        <w:jc w:val="both"/>
+        <w:rPr>
+          <w:rFonts w:ascii="Arial" w:hAnsi="Arial" w:cs="Arial"/>
+          <w:sz w:val="18"/>
+          <w:szCs w:val="18"/>
+        </w:rPr>
+      </w:pPr>
+      <w:r>
+        <w:rPr>
+          <w:rStyle w:val="Refdenotaalpie"/>
+          <w:rFonts w:ascii="Arial" w:hAnsi="Arial" w:cs="Arial"/>
+          <w:sz w:val="18"/>
+          <w:szCs w:val="18"/>
+        </w:rPr>
+        <w:footnoteRef/>
+      </w:r>
+      <w:r>
+        <w:rPr>
+          <w:rFonts w:ascii="Arial" w:hAnsi="Arial" w:cs="Arial"/>
+          <w:sz w:val="18"/>
+          <w:szCs w:val="18"/>
+        </w:rPr>
+        <w:t xml:space="preserve"> Si bien el Reglamento fue modificado mediante el Decreto Supremo N° 017-2026-MINEDU, dicha modificación entra en vigencia al día siguiente de su publicación, es decir, el 25 de setiembre de 2026. Por ello, no resulta aplicable al presente caso.</w:t>
+      </w:r>
+    </w:p>
+  </w:footnote>
+  <w:footnote w:id="2">
+    <w:p>
+      <w:pPr>
+        <w:pStyle w:val="Textonotapie"/>
+        <w:jc w:val="both"/>
+        <w:rPr>
+          <w:lang w:val="es-ES"/>
+        </w:rPr>
+      </w:pPr>
+      <w:r>
+        <w:rPr>
+          <w:rStyle w:val="Refdenotaalpie"/>
+        </w:rPr>
+        <w:footnoteRef/>
+      </w:r>
+      <w:r>
+        <w:t xml:space="preserve"> </w:t>
+      </w:r>
+      <w:r>
+        <w:rPr>
+          <w:rFonts w:ascii="Arial" w:hAnsi="Arial" w:cs="Arial"/>
+          <w:sz w:val="18"/>
+          <w:szCs w:val="18"/>
+        </w:rPr>
+        <w:t xml:space="preserve">Si bien las “Disposiciones para el becario del PRONABEC”, fue modificado mediante Resolución </w:t>
+      </w:r>
+      <w:r>
+        <w:rPr>
+          <w:rFonts w:ascii="Arial" w:eastAsia="Arial" w:hAnsi="Arial" w:cs="Arial"/>
+          <w:sz w:val="18"/>
+          <w:szCs w:val="18"/>
+          <w:lang w:val="es-ES"/>
+        </w:rPr>
+        <w:t xml:space="preserve">Directoral Ejecutiva N° </w:t>
+      </w:r>
+      <w:r>
+        <w:rPr>
+          <w:rFonts w:ascii="Arial" w:eastAsia="Arial" w:hAnsi="Arial" w:cs="Arial"/>
+          <w:sz w:val="18"/>
+          <w:szCs w:val="18"/>
+          <w:lang w:val="es-ES"/>
+        </w:rPr>
+        <w:t>1</w:t>
+      </w:r>
+      <w:r>
+        <w:rPr>
+          <w:rFonts w:ascii="Arial" w:eastAsia="Arial" w:hAnsi="Arial" w:cs="Arial"/>
+          <w:sz w:val="18"/>
+          <w:szCs w:val="18"/>
+          <w:lang w:val="es-ES"/>
+        </w:rPr>
+        <w:t>67-202</w:t>
+      </w:r>
+      <w:r>
+        <w:rPr>
+          <w:rFonts w:ascii="Arial" w:eastAsia="Arial" w:hAnsi="Arial" w:cs="Arial"/>
+          <w:sz w:val="18"/>
+          <w:szCs w:val="18"/>
+          <w:lang w:val="es-ES"/>
+        </w:rPr>
+        <w:t>6</w:t>
+      </w:r>
+      <w:r>
+        <w:rPr>
+          <w:rFonts w:ascii="Arial" w:eastAsia="Arial" w:hAnsi="Arial" w:cs="Arial"/>
+          <w:sz w:val="18"/>
+          <w:szCs w:val="18"/>
+          <w:lang w:val="es-ES"/>
+        </w:rPr>
+        <w:t>-MINEDU-VMGI-PRONABEC</w:t>
+      </w:r>
+      <w:r>
+        <w:rPr>
+          <w:rFonts w:ascii="Arial" w:hAnsi="Arial" w:cs="Arial"/>
+          <w:sz w:val="18"/>
+          <w:szCs w:val="18"/>
+        </w:rPr>
+        <w:t xml:space="preserve">, dicha modificación entra en vigencia al día siguiente de su publicación, es decir, el </w:t>
+      </w:r>
+      <w:r>
+        <w:rPr>
+          <w:rFonts w:ascii="Arial" w:hAnsi="Arial" w:cs="Arial"/>
+          <w:sz w:val="18"/>
+          <w:szCs w:val="18"/>
+        </w:rPr>
+        <w:t>01</w:t>
+      </w:r>
+      <w:r>
+        <w:rPr>
+          <w:rFonts w:ascii="Arial" w:hAnsi="Arial" w:cs="Arial"/>
+          <w:sz w:val="18"/>
+          <w:szCs w:val="18"/>
+        </w:rPr>
+        <w:t xml:space="preserve"> de </w:t>
+      </w:r>
+      <w:r>
+        <w:rPr>
+          <w:rFonts w:ascii="Arial" w:hAnsi="Arial" w:cs="Arial"/>
+          <w:sz w:val="18"/>
+          <w:szCs w:val="18"/>
+        </w:rPr>
+        <w:t>octubre</w:t>
+      </w:r>
+      <w:r>
+        <w:rPr>
+          <w:rFonts w:ascii="Arial" w:hAnsi="Arial" w:cs="Arial"/>
+          <w:sz w:val="18"/>
+          <w:szCs w:val="18"/>
+        </w:rPr>
+        <w:t xml:space="preserve"> de 2026. Por ello, no resulta aplicable al presente caso</w:t>
       </w:r>
     </w:p>
   </w:footnote>
@@ -10306,9 +10180,9 @@
   </w:style>
   <w:style w:type="character" w:styleId="Refdenotaalpie">
     <w:name w:val="footnote reference"/>
+    <w:aliases w:val="FC"/>
     <w:basedOn w:val="Fuentedeprrafopredeter"/>
     <w:uiPriority w:val="99"/>
-    <w:semiHidden/>
     <w:unhideWhenUsed/>
     <w:rsid w:val="00B86A87"/>
     <w:rPr>
@@ -10670,7 +10544,7 @@
 </file>
 
 <file path=customXml/itemProps1.xml><?xml version="1.0" encoding="utf-8"?>
-<ds:datastoreItem xmlns:ds="http://schemas.openxmlformats.org/officeDocument/2006/customXml" ds:itemID="{7D12FD08-7E22-4BE6-B8CC-B44DBF52C6F3}">
+<ds:datastoreItem xmlns:ds="http://schemas.openxmlformats.org/officeDocument/2006/customXml" ds:itemID="{BE829F46-DE01-4FD6-AA7F-E2ED985EC2AF}">
   <ds:schemaRefs>
     <ds:schemaRef ds:uri="http://schemas.openxmlformats.org/officeDocument/2006/bibliography"/>
   </ds:schemaRefs>

</xml_diff>

<commit_message>
fix: ajuste normativo RDE 067-2025, compatibilidad de listas Word y expediente del padron
- Deteccion ultra-robusta de fechas de solicitud en formato autogenerado (sin hora, segundos, texto, etc.)\n- Deteccion de listas automaticas Word (w:numPr) para evitar doble numeracion y garantizar reemplazo de RDE 067-2025 en 1.5, 2.3 y 2.5\n- Reemplazo dinamico de fecha de presentacion en numeral 2.6 y literales de referencia\n- Priorizacion de NEXPEDIENTE del Padron en cuadros y notificaciones Excel\n- Soporte integral para informe individual e informe multiple (coexistencia y fecha unica)
</commit_message>
<xml_diff>
--- a/plantillas/plantilla_informe.docx
+++ b/plantillas/plantilla_informe.docx
@@ -2937,7 +2937,16 @@
           <w:sz w:val="22"/>
           <w:szCs w:val="22"/>
         </w:rPr>
-        <w:t>{{ DEL</w:t>
+        <w:t xml:space="preserve">{{ </w:t>
+      </w:r>
+      <w:bookmarkStart w:id="4" w:name="_GoBack"/>
+      <w:bookmarkEnd w:id="4"/>
+      <w:r>
+        <w:rPr>
+          <w:sz w:val="22"/>
+          <w:szCs w:val="22"/>
+        </w:rPr>
+        <w:t>EL</w:t>
       </w:r>
       <w:proofErr w:type="gramEnd"/>
       <w:r>
@@ -4523,8 +4532,6 @@
           <w:lang w:val="es-ES"/>
         </w:rPr>
       </w:pPr>
-      <w:bookmarkStart w:id="4" w:name="_GoBack"/>
-      <w:bookmarkEnd w:id="4"/>
     </w:p>
     <w:p>
       <w:pPr>
@@ -10544,7 +10551,7 @@
 </file>
 
 <file path=customXml/itemProps1.xml><?xml version="1.0" encoding="utf-8"?>
-<ds:datastoreItem xmlns:ds="http://schemas.openxmlformats.org/officeDocument/2006/customXml" ds:itemID="{BE829F46-DE01-4FD6-AA7F-E2ED985EC2AF}">
+<ds:datastoreItem xmlns:ds="http://schemas.openxmlformats.org/officeDocument/2006/customXml" ds:itemID="{E9BF4672-2228-478D-BD55-E083C336109E}">
   <ds:schemaRefs>
     <ds:schemaRef ds:uri="http://schemas.openxmlformats.org/officeDocument/2006/bibliography"/>
   </ds:schemaRefs>

</xml_diff>

<commit_message>
feat: unificacion de modulos Ampliaciones y Actualizacion (De suspendido a regular) con nuevas plantillas
</commit_message>
<xml_diff>
--- a/plantillas/plantilla_informe.docx
+++ b/plantillas/plantilla_informe.docx
@@ -36,27 +36,7 @@
           <w:u w:val="single"/>
           <w:lang w:val="es-ES"/>
         </w:rPr>
-        <w:t>6</w:t>
-      </w:r>
-      <w:r>
-        <w:rPr>
-          <w:rFonts w:ascii="Arial" w:eastAsia="Arial" w:hAnsi="Arial" w:cs="Arial"/>
-          <w:b/>
-          <w:bCs/>
-          <w:u w:val="single"/>
-          <w:lang w:val="es-ES"/>
-        </w:rPr>
-        <w:t>34</w:t>
-      </w:r>
-      <w:r>
-        <w:rPr>
-          <w:rFonts w:ascii="Arial" w:eastAsia="Arial" w:hAnsi="Arial" w:cs="Arial"/>
-          <w:b/>
-          <w:bCs/>
-          <w:u w:val="single"/>
-          <w:lang w:val="es-ES"/>
-        </w:rPr>
-        <w:t>8</w:t>
+        <w:t>1234</w:t>
       </w:r>
       <w:r>
         <w:rPr>
@@ -172,20 +152,20 @@
           </w:tcPr>
           <w:p>
             <w:pPr>
+              <w:ind w:left="1416" w:right="-105" w:hanging="1416"/>
               <w:jc w:val="both"/>
               <w:rPr>
-                <w:rFonts w:ascii="Arial" w:eastAsia="Times New Roman" w:hAnsi="Arial" w:cs="Arial"/>
+                <w:rFonts w:ascii="Arial" w:eastAsia="Calibri" w:hAnsi="Arial" w:cs="Arial"/>
                 <w:b/>
-                <w:lang w:eastAsia="es-ES" w:bidi="es-ES"/>
               </w:rPr>
             </w:pPr>
             <w:r>
               <w:rPr>
                 <w:rFonts w:ascii="Arial" w:eastAsia="Times New Roman" w:hAnsi="Arial" w:cs="Arial"/>
                 <w:b/>
-                <w:lang w:eastAsia="es-ES" w:bidi="es-ES"/>
+                <w:lang w:val="es-ES" w:eastAsia="es-ES" w:bidi="es-ES"/>
               </w:rPr>
-              <w:t>ADRIANA SOYER VERRI</w:t>
+              <w:t>NELLY MIRIAM NÚÑEZ SÁNCHEZ</w:t>
             </w:r>
           </w:p>
           <w:p>
@@ -199,11 +179,26 @@
             </w:pPr>
             <w:r>
               <w:rPr>
+                <w:rFonts w:ascii="Arial" w:eastAsia="Calibri" w:hAnsi="Arial" w:cs="Arial"/>
+                <w:bCs/>
+              </w:rPr>
+              <w:t>Coordinadora</w:t>
+            </w:r>
+            <w:r>
+              <w:rPr>
                 <w:rFonts w:ascii="Arial" w:eastAsia="Times New Roman" w:hAnsi="Arial" w:cs="Arial"/>
                 <w:bCs/>
                 <w:lang w:eastAsia="es-ES" w:bidi="es-ES"/>
               </w:rPr>
-              <w:t>Coordinadora (e) de la Subdirección de Seguimiento y Supervisión</w:t>
+              <w:t xml:space="preserve"> </w:t>
+            </w:r>
+            <w:r>
+              <w:rPr>
+                <w:rFonts w:ascii="Arial" w:eastAsia="Times New Roman" w:hAnsi="Arial" w:cs="Arial"/>
+                <w:bCs/>
+                <w:lang w:eastAsia="es-ES" w:bidi="es-ES"/>
+              </w:rPr>
+              <w:t>de la Subdirección de Seguimiento y Supervisión</w:t>
             </w:r>
           </w:p>
           <w:p>
@@ -497,7 +492,7 @@
       </w:tr>
       <w:tr>
         <w:trPr>
-          <w:trHeight w:val="1170"/>
+          <w:trHeight w:val="853"/>
         </w:trPr>
         <w:tc>
           <w:tcPr>
@@ -702,6 +697,14 @@
           </w:p>
           <w:p>
             <w:pPr>
+              <w:jc w:val="both"/>
+              <w:rPr>
+                <w:rFonts w:ascii="Arial" w:hAnsi="Arial" w:cs="Arial"/>
+              </w:rPr>
+            </w:pPr>
+          </w:p>
+          <w:p>
+            <w:pPr>
               <w:jc w:val="right"/>
               <w:rPr>
                 <w:rFonts w:ascii="Arial" w:hAnsi="Arial" w:cs="Arial"/>
@@ -1252,7 +1255,14 @@
           <w:sz w:val="22"/>
           <w:szCs w:val="22"/>
         </w:rPr>
-        <w:t xml:space="preserve"> y Cooperación Regional Lima</w:t>
+        <w:t xml:space="preserve"> y </w:t>
+      </w:r>
+      <w:r>
+        <w:rPr>
+          <w:sz w:val="22"/>
+          <w:szCs w:val="22"/>
+        </w:rPr>
+        <w:t>Cooperación Regional Lima</w:t>
       </w:r>
       <w:bookmarkEnd w:id="1"/>
       <w:r>
@@ -1260,14 +1270,7 @@
           <w:sz w:val="22"/>
           <w:szCs w:val="22"/>
         </w:rPr>
-        <w:t xml:space="preserve">, traslada la </w:t>
-      </w:r>
-      <w:r>
-        <w:rPr>
-          <w:sz w:val="22"/>
-          <w:szCs w:val="22"/>
-        </w:rPr>
-        <w:t xml:space="preserve">solicitud de ampliación excepcional de la duración del periodo de estudios </w:t>
+        <w:t xml:space="preserve">, traslada la solicitud de ampliación excepcional de la duración del periodo de estudios </w:t>
       </w:r>
       <w:r>
         <w:rPr>
@@ -1316,7 +1319,14 @@
           <w:sz w:val="22"/>
           <w:szCs w:val="22"/>
         </w:rPr>
-        <w:t>1 becaria</w:t>
+        <w:t xml:space="preserve">1 </w:t>
+      </w:r>
+      <w:r>
+        <w:rPr>
+          <w:sz w:val="22"/>
+          <w:szCs w:val="22"/>
+        </w:rPr>
+        <w:t>{{ EL_LA_BECARIO_A }}</w:t>
       </w:r>
       <w:r>
         <w:rPr>
@@ -1338,7 +1348,7 @@
           <w:sz w:val="22"/>
           <w:szCs w:val="22"/>
         </w:rPr>
-        <w:t>Beca 18 - Convocatoria 2021</w:t>
+        <w:t>{{ BECA_Y_CONVOCATORIA_VALIDADA }}</w:t>
       </w:r>
       <w:r>
         <w:rPr>
@@ -1400,7 +1410,7 @@
         <w:gridCol w:w="1527"/>
         <w:gridCol w:w="2955"/>
         <w:gridCol w:w="1945"/>
-        <w:gridCol w:w="3449"/>
+        <w:gridCol w:w="2414"/>
         <w:gridCol w:w="1966"/>
         <w:gridCol w:w="2126"/>
         <w:gridCol w:w="2483"/>
@@ -1713,11 +1723,8 @@
             <w:vAlign w:val="center"/>
           </w:tcPr>
           <w:p>
-            <w:pPr>
-              <w:jc w:val="center"/>
-            </w:pPr>
             <w:r>
-              <w:t>{{ BECA_Y_CONVOCATORIA_VALIDADA }}</w:t>
+              <w:t>{{ BECA_Y_CONVOCATORIA }}</w:t>
             </w:r>
           </w:p>
         </w:tc>
@@ -2195,11 +2202,20 @@
           <w:sz w:val="22"/>
           <w:szCs w:val="22"/>
         </w:rPr>
-        <w:t xml:space="preserve">El becario presenta la solicitud de ampliación excepcional de un (1) período de estudios, por Mesa de Partes del PRONABEC al culminar su último período programado en el SIBEC </w:t>
-      </w:r>
-      <w:r>
-        <w:rPr>
-          <w:b/>
+        <w:t xml:space="preserve">El becario presenta la solicitud de ampliación excepcional de un (1) período de estudios, por Mesa de Partes del PRONABEC al culminar su último período programado en </w:t>
+      </w:r>
+      <w:bookmarkStart w:id="4" w:name="_GoBack"/>
+      <w:bookmarkEnd w:id="4"/>
+      <w:r>
+        <w:rPr>
+          <w:i/>
+          <w:sz w:val="22"/>
+          <w:szCs w:val="22"/>
+        </w:rPr>
+        <w:t xml:space="preserve">el SIBEC </w:t>
+      </w:r>
+      <w:r>
+        <w:rPr>
           <w:bCs/>
           <w:i/>
           <w:sz w:val="22"/>
@@ -2213,40 +2229,36 @@
           <w:sz w:val="22"/>
           <w:szCs w:val="22"/>
         </w:rPr>
-        <w:t xml:space="preserve">, adjuntando la documentación que acredite que aún no ha culminado la carrera o programa de estudios y que precise los cursos pendientes que tiene el becario. La ampliación excepcional se otorga por un (1) período académico adicional, </w:t>
-      </w:r>
-      <w:r>
-        <w:rPr>
-          <w:b/>
+        <w:t xml:space="preserve">, adjuntando la documentación que acredite que aún no ha culminado la carrera o programa de estudios y que precise los cursos pendientes que tiene el becario. La ampliación excepcional se otorga por un </w:t>
+      </w:r>
+      <w:r>
+        <w:rPr>
+          <w:i/>
+          <w:sz w:val="22"/>
+          <w:szCs w:val="22"/>
+        </w:rPr>
+        <w:lastRenderedPageBreak/>
+        <w:t xml:space="preserve">(1) período académico adicional, </w:t>
+      </w:r>
+      <w:r>
+        <w:rPr>
           <w:bCs/>
           <w:i/>
           <w:sz w:val="22"/>
           <w:szCs w:val="22"/>
         </w:rPr>
-        <w:t xml:space="preserve">está sujeta a la disponibilidad </w:t>
-      </w:r>
-      <w:r>
-        <w:rPr>
-          <w:b/>
-          <w:bCs/>
+        <w:t>está sujeta a la disponibilidad presupuestal</w:t>
+      </w:r>
+      <w:r>
+        <w:rPr>
           <w:i/>
           <w:sz w:val="22"/>
           <w:szCs w:val="22"/>
         </w:rPr>
-        <w:lastRenderedPageBreak/>
-        <w:t>presupuestal</w:t>
-      </w:r>
-      <w:r>
-        <w:rPr>
-          <w:i/>
-          <w:sz w:val="22"/>
-          <w:szCs w:val="22"/>
-        </w:rPr>
         <w:t xml:space="preserve">, se debe efectuar en el período académico inmediato posterior al término del período de estudios programado </w:t>
       </w:r>
       <w:r>
         <w:rPr>
-          <w:b/>
           <w:bCs/>
           <w:i/>
           <w:sz w:val="22"/>
@@ -2309,7 +2321,16 @@
           <w:sz w:val="22"/>
           <w:szCs w:val="22"/>
         </w:rPr>
-        <w:t>La OAGD traslada la solicitud a la SUCCOR, quien se encarga de verificar la información presentada por el becario y remite, mediante informe, el expediente a la DIBEC</w:t>
+        <w:t>La OAGD traslada la solicitud a la SUCCOR, quien se encarga de verificar la información presentada</w:t>
+      </w:r>
+      <w:r>
+        <w:rPr>
+          <w:i/>
+          <w:iCs/>
+          <w:sz w:val="22"/>
+          <w:szCs w:val="22"/>
+        </w:rPr>
+        <w:t xml:space="preserve"> por el becario y remite, mediante informe, el expediente a la DIBEC</w:t>
       </w:r>
       <w:r>
         <w:rPr>
@@ -2867,7 +2888,23 @@
           <w:sz w:val="22"/>
           <w:szCs w:val="22"/>
         </w:rPr>
-        <w:t>a solicitud {{ DEL_BECARIO_A }} fue ingresada por mesa de partes el {{ FECHA_SOLICITUD_TEXTO }}, por lo tanto, se verifica que fue presentado antes de la matrícula e inicio del periodo académico a ampliar.</w:t>
+        <w:t xml:space="preserve">a solicitud </w:t>
+      </w:r>
+      <w:proofErr w:type="gramStart"/>
+      <w:r>
+        <w:rPr>
+          <w:sz w:val="22"/>
+          <w:szCs w:val="22"/>
+        </w:rPr>
+        <w:t>{{ EL</w:t>
+      </w:r>
+      <w:proofErr w:type="gramEnd"/>
+      <w:r>
+        <w:rPr>
+          <w:sz w:val="22"/>
+          <w:szCs w:val="22"/>
+        </w:rPr>
+        <w:t>_BECARIO_A }} fue ingresada por mesa de partes el {{ FECHA_SOLICITUD_TEXTO }}, por lo tanto, se verifica que fue presentado antes de la matrícula e inicio del periodo académico a ampliar.</w:t>
       </w:r>
     </w:p>
     <w:p>
@@ -2929,7 +2966,21 @@
           <w:sz w:val="22"/>
           <w:szCs w:val="22"/>
         </w:rPr>
-        <w:t xml:space="preserve">, se revisó la información de los cursos pendientes informados por </w:t>
+        <w:t xml:space="preserve">, se revisó la información de los cursos pendientes </w:t>
+      </w:r>
+      <w:r>
+        <w:rPr>
+          <w:sz w:val="22"/>
+          <w:szCs w:val="22"/>
+        </w:rPr>
+        <w:t>señalados en la</w:t>
+      </w:r>
+      <w:r>
+        <w:rPr>
+          <w:sz w:val="22"/>
+          <w:szCs w:val="22"/>
+        </w:rPr>
+        <w:t xml:space="preserve"> solicitud </w:t>
       </w:r>
       <w:proofErr w:type="gramStart"/>
       <w:r>
@@ -2937,16 +2988,7 @@
           <w:sz w:val="22"/>
           <w:szCs w:val="22"/>
         </w:rPr>
-        <w:t xml:space="preserve">{{ </w:t>
-      </w:r>
-      <w:bookmarkStart w:id="4" w:name="_GoBack"/>
-      <w:bookmarkEnd w:id="4"/>
-      <w:r>
-        <w:rPr>
-          <w:sz w:val="22"/>
-          <w:szCs w:val="22"/>
-        </w:rPr>
-        <w:t>EL</w:t>
+        <w:t>{{ DEL</w:t>
       </w:r>
       <w:proofErr w:type="gramEnd"/>
       <w:r>
@@ -2961,7 +3003,7 @@
           <w:sz w:val="22"/>
           <w:szCs w:val="22"/>
         </w:rPr>
-        <w:t>en su solicitud y la información remitida m</w:t>
+        <w:t>y la información remitida m</w:t>
       </w:r>
       <w:r>
         <w:rPr>
@@ -2982,7 +3024,15 @@
           <w:sz w:val="22"/>
           <w:szCs w:val="22"/>
         </w:rPr>
-        <w:t xml:space="preserve">la {{ INSTITUCION }} remite la relación de cursos que tiene pendiente {{ EL_LA_BECARIO_A }} {{ NOMBRE_PRIMERO_NOMBRES }} al finalizar el semestre {{ SEMESTRE_ANTERIOR }}. De la revisión de dicho documento se observa que </w:t>
+        <w:t xml:space="preserve">la {{ INSTITUCION }} remite la relación de cursos que tiene pendiente {{ EL_LA_BECARIO_A }} {{ NOMBRE_PRIMERO_NOMBRES }} al finalizar el semestre {{ SEMESTRE_ANTERIOR }}. De la revisión de dicho documento se </w:t>
+      </w:r>
+      <w:r>
+        <w:rPr>
+          <w:sz w:val="22"/>
+          <w:szCs w:val="22"/>
+        </w:rPr>
+        <w:lastRenderedPageBreak/>
+        <w:t xml:space="preserve">observa que </w:t>
       </w:r>
       <w:proofErr w:type="gramStart"/>
       <w:r>
@@ -2998,15 +3048,7 @@
           <w:sz w:val="22"/>
           <w:szCs w:val="22"/>
         </w:rPr>
-        <w:t xml:space="preserve">_LA_BECARIO_A }} tiene cursos pendientes, los cuales </w:t>
-      </w:r>
-      <w:r>
-        <w:rPr>
-          <w:sz w:val="22"/>
-          <w:szCs w:val="22"/>
-        </w:rPr>
-        <w:lastRenderedPageBreak/>
-        <w:t>acreditan que aún no ha culminado sus estudios y que dichos cursos pueden cursarse en un periodo académico adicional, en este caso, en el semestre {{ SEMESTRE_SOLICITADO }}.</w:t>
+        <w:t>_LA_BECARIO_A }} tiene cursos pendientes, los cuales acreditan que aún no ha culminado sus estudios y que dichos cursos pueden cursarse en un periodo académico adicional, en este caso, en el semestre {{ SEMESTRE_SOLICITADO }}.</w:t>
       </w:r>
     </w:p>
     <w:p>
@@ -3303,849 +3345,6 @@
         <w:t>_FIN_SIBEC }}</w:t>
       </w:r>
     </w:p>
-    <w:p>
-      <w:pPr>
-        <w:pStyle w:val="Default"/>
-        <w:ind w:left="567"/>
-        <w:jc w:val="both"/>
-        <w:rPr>
-          <w:sz w:val="22"/>
-          <w:szCs w:val="22"/>
-        </w:rPr>
-      </w:pPr>
-    </w:p>
-    <w:p>
-      <w:pPr>
-        <w:pStyle w:val="Default"/>
-        <w:numPr>
-          <w:ilvl w:val="1"/>
-          <w:numId w:val="11"/>
-        </w:numPr>
-        <w:ind w:left="567"/>
-        <w:jc w:val="both"/>
-        <w:rPr>
-          <w:sz w:val="22"/>
-          <w:szCs w:val="22"/>
-        </w:rPr>
-      </w:pPr>
-      <w:r>
-        <w:rPr>
-          <w:sz w:val="22"/>
-          <w:szCs w:val="22"/>
-        </w:rPr>
-        <w:t xml:space="preserve">Asimismo, de acuerdo a la duración de estudios programada en el SIBEC, se tuvo previsto que </w:t>
-      </w:r>
-      <w:proofErr w:type="gramStart"/>
-      <w:r>
-        <w:rPr>
-          <w:sz w:val="22"/>
-          <w:szCs w:val="22"/>
-        </w:rPr>
-        <w:t>{{ EL</w:t>
-      </w:r>
-      <w:proofErr w:type="gramEnd"/>
-      <w:r>
-        <w:rPr>
-          <w:sz w:val="22"/>
-          <w:szCs w:val="22"/>
-        </w:rPr>
-        <w:t>_LA_BECARIO_A }} finalice los estudios en el semestre {{ SEMESTRE_ANTERIOR }}.</w:t>
-      </w:r>
-    </w:p>
-    <w:p>
-      <w:pPr>
-        <w:pStyle w:val="Default"/>
-        <w:ind w:left="567"/>
-        <w:jc w:val="both"/>
-        <w:rPr>
-          <w:sz w:val="22"/>
-          <w:szCs w:val="22"/>
-        </w:rPr>
-      </w:pPr>
-    </w:p>
-    <w:tbl>
-      <w:tblPr>
-        <w:tblStyle w:val="Tablaconcuadrcula"/>
-        <w:tblW w:w="0" w:type="auto"/>
-        <w:jc w:val="center"/>
-        <w:tblLook w:val="04A0" w:firstRow="1" w:lastRow="0" w:firstColumn="1" w:lastColumn="0" w:noHBand="0" w:noVBand="1"/>
-      </w:tblPr>
-      <w:tblGrid>
-        <w:gridCol w:w="1605"/>
-        <w:gridCol w:w="1584"/>
-        <w:gridCol w:w="1605"/>
-      </w:tblGrid>
-      <w:tr>
-        <w:trPr>
-          <w:trHeight w:val="144"/>
-          <w:jc w:val="center"/>
-        </w:trPr>
-        <w:tc>
-          <w:tcPr>
-            <w:tcW w:w="1605" w:type="dxa"/>
-          </w:tcPr>
-          <w:p>
-            <w:pPr>
-              <w:pStyle w:val="Default"/>
-              <w:jc w:val="center"/>
-              <w:rPr>
-                <w:b/>
-                <w:bCs/>
-                <w:sz w:val="20"/>
-                <w:szCs w:val="20"/>
-              </w:rPr>
-            </w:pPr>
-            <w:r>
-              <w:rPr>
-                <w:b/>
-                <w:bCs/>
-                <w:sz w:val="20"/>
-                <w:szCs w:val="20"/>
-              </w:rPr>
-              <w:t>Momento</w:t>
-            </w:r>
-          </w:p>
-        </w:tc>
-        <w:tc>
-          <w:tcPr>
-            <w:tcW w:w="1584" w:type="dxa"/>
-          </w:tcPr>
-          <w:p>
-            <w:pPr>
-              <w:pStyle w:val="Default"/>
-              <w:jc w:val="center"/>
-              <w:rPr>
-                <w:b/>
-                <w:bCs/>
-                <w:sz w:val="20"/>
-                <w:szCs w:val="20"/>
-              </w:rPr>
-            </w:pPr>
-            <w:r>
-              <w:rPr>
-                <w:b/>
-                <w:bCs/>
-                <w:sz w:val="20"/>
-                <w:szCs w:val="20"/>
-              </w:rPr>
-              <w:t>C</w:t>
-            </w:r>
-            <w:r>
-              <w:rPr>
-                <w:b/>
-                <w:bCs/>
-                <w:sz w:val="20"/>
-                <w:szCs w:val="20"/>
-              </w:rPr>
-              <w:t>iclo</w:t>
-            </w:r>
-          </w:p>
-        </w:tc>
-        <w:tc>
-          <w:tcPr>
-            <w:tcW w:w="1605" w:type="dxa"/>
-          </w:tcPr>
-          <w:p>
-            <w:pPr>
-              <w:pStyle w:val="Default"/>
-              <w:jc w:val="center"/>
-              <w:rPr>
-                <w:b/>
-                <w:bCs/>
-                <w:sz w:val="20"/>
-                <w:szCs w:val="20"/>
-              </w:rPr>
-            </w:pPr>
-            <w:r>
-              <w:rPr>
-                <w:b/>
-                <w:bCs/>
-                <w:sz w:val="20"/>
-                <w:szCs w:val="20"/>
-              </w:rPr>
-              <w:t>S</w:t>
-            </w:r>
-            <w:r>
-              <w:rPr>
-                <w:b/>
-                <w:bCs/>
-                <w:sz w:val="20"/>
-                <w:szCs w:val="20"/>
-              </w:rPr>
-              <w:t>emestre</w:t>
-            </w:r>
-          </w:p>
-        </w:tc>
-      </w:tr>
-      <w:tr>
-        <w:trPr>
-          <w:trHeight w:val="144"/>
-          <w:jc w:val="center"/>
-        </w:trPr>
-        <w:tc>
-          <w:tcPr>
-            <w:tcW w:w="1605" w:type="dxa"/>
-            <w:vMerge w:val="restart"/>
-            <w:vAlign w:val="center"/>
-          </w:tcPr>
-          <w:p>
-            <w:pPr>
-              <w:pStyle w:val="Default"/>
-              <w:jc w:val="center"/>
-              <w:rPr>
-                <w:sz w:val="20"/>
-                <w:szCs w:val="20"/>
-              </w:rPr>
-            </w:pPr>
-            <w:r>
-              <w:rPr>
-                <w:sz w:val="20"/>
-                <w:szCs w:val="20"/>
-              </w:rPr>
-              <w:t>Duración de estudios</w:t>
-            </w:r>
-          </w:p>
-        </w:tc>
-        <w:tc>
-          <w:tcPr>
-            <w:tcW w:w="1584" w:type="dxa"/>
-          </w:tcPr>
-          <w:p>
-            <w:pPr>
-              <w:pStyle w:val="Default"/>
-              <w:jc w:val="center"/>
-              <w:rPr>
-                <w:sz w:val="20"/>
-                <w:szCs w:val="20"/>
-              </w:rPr>
-            </w:pPr>
-            <w:r>
-              <w:rPr>
-                <w:sz w:val="20"/>
-                <w:szCs w:val="20"/>
-              </w:rPr>
-              <w:t>1er ciclo</w:t>
-            </w:r>
-          </w:p>
-        </w:tc>
-        <w:tc>
-          <w:tcPr>
-            <w:tcW w:w="1605" w:type="dxa"/>
-          </w:tcPr>
-          <w:p>
-            <w:pPr>
-              <w:pStyle w:val="Default"/>
-              <w:jc w:val="center"/>
-              <w:rPr>
-                <w:sz w:val="20"/>
-                <w:szCs w:val="20"/>
-              </w:rPr>
-            </w:pPr>
-            <w:r>
-              <w:rPr>
-                <w:sz w:val="20"/>
-                <w:szCs w:val="20"/>
-              </w:rPr>
-              <w:t>2021-II</w:t>
-            </w:r>
-          </w:p>
-        </w:tc>
-      </w:tr>
-      <w:tr>
-        <w:trPr>
-          <w:trHeight w:val="152"/>
-          <w:jc w:val="center"/>
-        </w:trPr>
-        <w:tc>
-          <w:tcPr>
-            <w:tcW w:w="1605" w:type="dxa"/>
-            <w:vMerge/>
-          </w:tcPr>
-          <w:p>
-            <w:pPr>
-              <w:pStyle w:val="Default"/>
-              <w:jc w:val="both"/>
-              <w:rPr>
-                <w:sz w:val="20"/>
-                <w:szCs w:val="20"/>
-              </w:rPr>
-            </w:pPr>
-          </w:p>
-        </w:tc>
-        <w:tc>
-          <w:tcPr>
-            <w:tcW w:w="1584" w:type="dxa"/>
-          </w:tcPr>
-          <w:p>
-            <w:pPr>
-              <w:pStyle w:val="Default"/>
-              <w:jc w:val="center"/>
-              <w:rPr>
-                <w:sz w:val="20"/>
-                <w:szCs w:val="20"/>
-              </w:rPr>
-            </w:pPr>
-            <w:r>
-              <w:rPr>
-                <w:sz w:val="20"/>
-                <w:szCs w:val="20"/>
-              </w:rPr>
-              <w:t>2do ciclo</w:t>
-            </w:r>
-          </w:p>
-        </w:tc>
-        <w:tc>
-          <w:tcPr>
-            <w:tcW w:w="1605" w:type="dxa"/>
-          </w:tcPr>
-          <w:p>
-            <w:pPr>
-              <w:pStyle w:val="Default"/>
-              <w:jc w:val="center"/>
-              <w:rPr>
-                <w:sz w:val="20"/>
-                <w:szCs w:val="20"/>
-              </w:rPr>
-            </w:pPr>
-            <w:r>
-              <w:rPr>
-                <w:sz w:val="20"/>
-                <w:szCs w:val="20"/>
-              </w:rPr>
-              <w:t>2022-I</w:t>
-            </w:r>
-          </w:p>
-        </w:tc>
-      </w:tr>
-      <w:tr>
-        <w:trPr>
-          <w:trHeight w:val="144"/>
-          <w:jc w:val="center"/>
-        </w:trPr>
-        <w:tc>
-          <w:tcPr>
-            <w:tcW w:w="1605" w:type="dxa"/>
-            <w:vMerge/>
-          </w:tcPr>
-          <w:p>
-            <w:pPr>
-              <w:pStyle w:val="Default"/>
-              <w:jc w:val="both"/>
-              <w:rPr>
-                <w:sz w:val="20"/>
-                <w:szCs w:val="20"/>
-              </w:rPr>
-            </w:pPr>
-          </w:p>
-        </w:tc>
-        <w:tc>
-          <w:tcPr>
-            <w:tcW w:w="1584" w:type="dxa"/>
-          </w:tcPr>
-          <w:p>
-            <w:pPr>
-              <w:pStyle w:val="Default"/>
-              <w:jc w:val="center"/>
-              <w:rPr>
-                <w:sz w:val="20"/>
-                <w:szCs w:val="20"/>
-              </w:rPr>
-            </w:pPr>
-            <w:r>
-              <w:rPr>
-                <w:sz w:val="20"/>
-                <w:szCs w:val="20"/>
-              </w:rPr>
-              <w:t>3er ciclo</w:t>
-            </w:r>
-          </w:p>
-        </w:tc>
-        <w:tc>
-          <w:tcPr>
-            <w:tcW w:w="1605" w:type="dxa"/>
-          </w:tcPr>
-          <w:p>
-            <w:pPr>
-              <w:pStyle w:val="Default"/>
-              <w:jc w:val="center"/>
-              <w:rPr>
-                <w:sz w:val="20"/>
-                <w:szCs w:val="20"/>
-              </w:rPr>
-            </w:pPr>
-            <w:r>
-              <w:rPr>
-                <w:sz w:val="20"/>
-                <w:szCs w:val="20"/>
-              </w:rPr>
-              <w:t>2022-II</w:t>
-            </w:r>
-          </w:p>
-        </w:tc>
-      </w:tr>
-      <w:tr>
-        <w:trPr>
-          <w:trHeight w:val="144"/>
-          <w:jc w:val="center"/>
-        </w:trPr>
-        <w:tc>
-          <w:tcPr>
-            <w:tcW w:w="1605" w:type="dxa"/>
-            <w:vMerge/>
-          </w:tcPr>
-          <w:p>
-            <w:pPr>
-              <w:pStyle w:val="Default"/>
-              <w:jc w:val="both"/>
-              <w:rPr>
-                <w:sz w:val="20"/>
-                <w:szCs w:val="20"/>
-              </w:rPr>
-            </w:pPr>
-          </w:p>
-        </w:tc>
-        <w:tc>
-          <w:tcPr>
-            <w:tcW w:w="1584" w:type="dxa"/>
-          </w:tcPr>
-          <w:p>
-            <w:pPr>
-              <w:pStyle w:val="Default"/>
-              <w:jc w:val="center"/>
-              <w:rPr>
-                <w:sz w:val="20"/>
-                <w:szCs w:val="20"/>
-              </w:rPr>
-            </w:pPr>
-            <w:r>
-              <w:rPr>
-                <w:sz w:val="20"/>
-                <w:szCs w:val="20"/>
-              </w:rPr>
-              <w:t>4to ciclo</w:t>
-            </w:r>
-          </w:p>
-        </w:tc>
-        <w:tc>
-          <w:tcPr>
-            <w:tcW w:w="1605" w:type="dxa"/>
-          </w:tcPr>
-          <w:p>
-            <w:pPr>
-              <w:pStyle w:val="Default"/>
-              <w:jc w:val="center"/>
-              <w:rPr>
-                <w:sz w:val="20"/>
-                <w:szCs w:val="20"/>
-              </w:rPr>
-            </w:pPr>
-            <w:r>
-              <w:rPr>
-                <w:sz w:val="20"/>
-                <w:szCs w:val="20"/>
-              </w:rPr>
-              <w:t>2023-I</w:t>
-            </w:r>
-          </w:p>
-        </w:tc>
-      </w:tr>
-      <w:tr>
-        <w:trPr>
-          <w:trHeight w:val="144"/>
-          <w:jc w:val="center"/>
-        </w:trPr>
-        <w:tc>
-          <w:tcPr>
-            <w:tcW w:w="1605" w:type="dxa"/>
-            <w:vMerge/>
-          </w:tcPr>
-          <w:p>
-            <w:pPr>
-              <w:pStyle w:val="Default"/>
-              <w:jc w:val="both"/>
-              <w:rPr>
-                <w:sz w:val="20"/>
-                <w:szCs w:val="20"/>
-              </w:rPr>
-            </w:pPr>
-          </w:p>
-        </w:tc>
-        <w:tc>
-          <w:tcPr>
-            <w:tcW w:w="1584" w:type="dxa"/>
-          </w:tcPr>
-          <w:p>
-            <w:pPr>
-              <w:pStyle w:val="Default"/>
-              <w:jc w:val="center"/>
-              <w:rPr>
-                <w:sz w:val="20"/>
-                <w:szCs w:val="20"/>
-              </w:rPr>
-            </w:pPr>
-            <w:r>
-              <w:rPr>
-                <w:sz w:val="20"/>
-                <w:szCs w:val="20"/>
-              </w:rPr>
-              <w:t>5to ciclo</w:t>
-            </w:r>
-          </w:p>
-        </w:tc>
-        <w:tc>
-          <w:tcPr>
-            <w:tcW w:w="1605" w:type="dxa"/>
-          </w:tcPr>
-          <w:p>
-            <w:pPr>
-              <w:pStyle w:val="Default"/>
-              <w:jc w:val="center"/>
-              <w:rPr>
-                <w:sz w:val="20"/>
-                <w:szCs w:val="20"/>
-              </w:rPr>
-            </w:pPr>
-            <w:r>
-              <w:rPr>
-                <w:sz w:val="20"/>
-                <w:szCs w:val="20"/>
-              </w:rPr>
-              <w:t>2023-II</w:t>
-            </w:r>
-          </w:p>
-        </w:tc>
-      </w:tr>
-      <w:tr>
-        <w:trPr>
-          <w:trHeight w:val="144"/>
-          <w:jc w:val="center"/>
-        </w:trPr>
-        <w:tc>
-          <w:tcPr>
-            <w:tcW w:w="1605" w:type="dxa"/>
-            <w:vMerge/>
-          </w:tcPr>
-          <w:p>
-            <w:pPr>
-              <w:pStyle w:val="Default"/>
-              <w:jc w:val="both"/>
-              <w:rPr>
-                <w:sz w:val="20"/>
-                <w:szCs w:val="20"/>
-              </w:rPr>
-            </w:pPr>
-          </w:p>
-        </w:tc>
-        <w:tc>
-          <w:tcPr>
-            <w:tcW w:w="1584" w:type="dxa"/>
-          </w:tcPr>
-          <w:p>
-            <w:pPr>
-              <w:pStyle w:val="Default"/>
-              <w:jc w:val="center"/>
-              <w:rPr>
-                <w:sz w:val="20"/>
-                <w:szCs w:val="20"/>
-              </w:rPr>
-            </w:pPr>
-            <w:r>
-              <w:rPr>
-                <w:sz w:val="20"/>
-                <w:szCs w:val="20"/>
-              </w:rPr>
-              <w:t>6to ciclo</w:t>
-            </w:r>
-          </w:p>
-        </w:tc>
-        <w:tc>
-          <w:tcPr>
-            <w:tcW w:w="1605" w:type="dxa"/>
-          </w:tcPr>
-          <w:p>
-            <w:pPr>
-              <w:pStyle w:val="Default"/>
-              <w:jc w:val="center"/>
-              <w:rPr>
-                <w:sz w:val="20"/>
-                <w:szCs w:val="20"/>
-              </w:rPr>
-            </w:pPr>
-            <w:r>
-              <w:rPr>
-                <w:sz w:val="20"/>
-                <w:szCs w:val="20"/>
-              </w:rPr>
-              <w:t>2024-I</w:t>
-            </w:r>
-          </w:p>
-        </w:tc>
-      </w:tr>
-      <w:tr>
-        <w:trPr>
-          <w:trHeight w:val="144"/>
-          <w:jc w:val="center"/>
-        </w:trPr>
-        <w:tc>
-          <w:tcPr>
-            <w:tcW w:w="1605" w:type="dxa"/>
-            <w:vMerge/>
-          </w:tcPr>
-          <w:p>
-            <w:pPr>
-              <w:pStyle w:val="Default"/>
-              <w:jc w:val="both"/>
-              <w:rPr>
-                <w:sz w:val="20"/>
-                <w:szCs w:val="20"/>
-              </w:rPr>
-            </w:pPr>
-          </w:p>
-        </w:tc>
-        <w:tc>
-          <w:tcPr>
-            <w:tcW w:w="1584" w:type="dxa"/>
-          </w:tcPr>
-          <w:p>
-            <w:pPr>
-              <w:pStyle w:val="Default"/>
-              <w:jc w:val="center"/>
-              <w:rPr>
-                <w:sz w:val="20"/>
-                <w:szCs w:val="20"/>
-              </w:rPr>
-            </w:pPr>
-            <w:r>
-              <w:rPr>
-                <w:sz w:val="20"/>
-                <w:szCs w:val="20"/>
-              </w:rPr>
-              <w:t>7mo ciclo</w:t>
-            </w:r>
-          </w:p>
-        </w:tc>
-        <w:tc>
-          <w:tcPr>
-            <w:tcW w:w="1605" w:type="dxa"/>
-          </w:tcPr>
-          <w:p>
-            <w:pPr>
-              <w:pStyle w:val="Default"/>
-              <w:jc w:val="center"/>
-              <w:rPr>
-                <w:sz w:val="20"/>
-                <w:szCs w:val="20"/>
-              </w:rPr>
-            </w:pPr>
-            <w:r>
-              <w:rPr>
-                <w:sz w:val="20"/>
-                <w:szCs w:val="20"/>
-              </w:rPr>
-              <w:t>2024-II</w:t>
-            </w:r>
-          </w:p>
-        </w:tc>
-      </w:tr>
-      <w:tr>
-        <w:trPr>
-          <w:trHeight w:val="144"/>
-          <w:jc w:val="center"/>
-        </w:trPr>
-        <w:tc>
-          <w:tcPr>
-            <w:tcW w:w="1605" w:type="dxa"/>
-            <w:vMerge/>
-          </w:tcPr>
-          <w:p>
-            <w:pPr>
-              <w:pStyle w:val="Default"/>
-              <w:jc w:val="both"/>
-              <w:rPr>
-                <w:sz w:val="20"/>
-                <w:szCs w:val="20"/>
-              </w:rPr>
-            </w:pPr>
-          </w:p>
-        </w:tc>
-        <w:tc>
-          <w:tcPr>
-            <w:tcW w:w="1584" w:type="dxa"/>
-          </w:tcPr>
-          <w:p>
-            <w:pPr>
-              <w:pStyle w:val="Default"/>
-              <w:jc w:val="center"/>
-              <w:rPr>
-                <w:sz w:val="20"/>
-                <w:szCs w:val="20"/>
-              </w:rPr>
-            </w:pPr>
-            <w:r>
-              <w:rPr>
-                <w:sz w:val="20"/>
-                <w:szCs w:val="20"/>
-              </w:rPr>
-              <w:t>8vo ciclo</w:t>
-            </w:r>
-          </w:p>
-        </w:tc>
-        <w:tc>
-          <w:tcPr>
-            <w:tcW w:w="1605" w:type="dxa"/>
-          </w:tcPr>
-          <w:p>
-            <w:pPr>
-              <w:pStyle w:val="Default"/>
-              <w:jc w:val="center"/>
-              <w:rPr>
-                <w:sz w:val="20"/>
-                <w:szCs w:val="20"/>
-              </w:rPr>
-            </w:pPr>
-            <w:r>
-              <w:rPr>
-                <w:sz w:val="20"/>
-                <w:szCs w:val="20"/>
-              </w:rPr>
-              <w:t>2025-I</w:t>
-            </w:r>
-          </w:p>
-        </w:tc>
-      </w:tr>
-      <w:tr>
-        <w:trPr>
-          <w:trHeight w:val="144"/>
-          <w:jc w:val="center"/>
-        </w:trPr>
-        <w:tc>
-          <w:tcPr>
-            <w:tcW w:w="1605" w:type="dxa"/>
-            <w:vMerge/>
-          </w:tcPr>
-          <w:p>
-            <w:pPr>
-              <w:pStyle w:val="Default"/>
-              <w:jc w:val="both"/>
-              <w:rPr>
-                <w:sz w:val="20"/>
-                <w:szCs w:val="20"/>
-              </w:rPr>
-            </w:pPr>
-          </w:p>
-        </w:tc>
-        <w:tc>
-          <w:tcPr>
-            <w:tcW w:w="1584" w:type="dxa"/>
-          </w:tcPr>
-          <w:p>
-            <w:pPr>
-              <w:pStyle w:val="Default"/>
-              <w:jc w:val="center"/>
-              <w:rPr>
-                <w:sz w:val="20"/>
-                <w:szCs w:val="20"/>
-              </w:rPr>
-            </w:pPr>
-            <w:r>
-              <w:rPr>
-                <w:sz w:val="20"/>
-                <w:szCs w:val="20"/>
-              </w:rPr>
-              <w:t>9no ciclo</w:t>
-            </w:r>
-          </w:p>
-        </w:tc>
-        <w:tc>
-          <w:tcPr>
-            <w:tcW w:w="1605" w:type="dxa"/>
-          </w:tcPr>
-          <w:p>
-            <w:pPr>
-              <w:pStyle w:val="Default"/>
-              <w:jc w:val="center"/>
-              <w:rPr>
-                <w:sz w:val="20"/>
-                <w:szCs w:val="20"/>
-              </w:rPr>
-            </w:pPr>
-            <w:r>
-              <w:rPr>
-                <w:sz w:val="20"/>
-                <w:szCs w:val="20"/>
-              </w:rPr>
-              <w:t>2025-II</w:t>
-            </w:r>
-          </w:p>
-        </w:tc>
-      </w:tr>
-      <w:tr>
-        <w:trPr>
-          <w:trHeight w:val="144"/>
-          <w:jc w:val="center"/>
-        </w:trPr>
-        <w:tc>
-          <w:tcPr>
-            <w:tcW w:w="1605" w:type="dxa"/>
-            <w:vMerge/>
-          </w:tcPr>
-          <w:p>
-            <w:pPr>
-              <w:pStyle w:val="Default"/>
-              <w:jc w:val="both"/>
-              <w:rPr>
-                <w:sz w:val="20"/>
-                <w:szCs w:val="20"/>
-              </w:rPr>
-            </w:pPr>
-          </w:p>
-        </w:tc>
-        <w:tc>
-          <w:tcPr>
-            <w:tcW w:w="1584" w:type="dxa"/>
-          </w:tcPr>
-          <w:p>
-            <w:pPr>
-              <w:pStyle w:val="Default"/>
-              <w:jc w:val="center"/>
-              <w:rPr>
-                <w:sz w:val="20"/>
-                <w:szCs w:val="20"/>
-              </w:rPr>
-            </w:pPr>
-            <w:r>
-              <w:rPr>
-                <w:sz w:val="20"/>
-                <w:szCs w:val="20"/>
-              </w:rPr>
-              <w:t>10mo ciclo</w:t>
-            </w:r>
-          </w:p>
-        </w:tc>
-        <w:tc>
-          <w:tcPr>
-            <w:tcW w:w="1605" w:type="dxa"/>
-          </w:tcPr>
-          <w:p>
-            <w:pPr>
-              <w:pStyle w:val="Default"/>
-              <w:jc w:val="center"/>
-              <w:rPr>
-                <w:sz w:val="20"/>
-                <w:szCs w:val="20"/>
-              </w:rPr>
-            </w:pPr>
-            <w:r>
-              <w:rPr>
-                <w:sz w:val="20"/>
-                <w:szCs w:val="20"/>
-              </w:rPr>
-              <w:t>2026-I</w:t>
-            </w:r>
-          </w:p>
-        </w:tc>
-      </w:tr>
-    </w:tbl>
     <w:p>
       <w:pPr>
         <w:pStyle w:val="Default"/>
@@ -4291,14 +3490,7 @@
         <w:rPr>
           <w:rFonts w:ascii="Arial" w:hAnsi="Arial" w:cs="Arial"/>
         </w:rPr>
-        <w:t xml:space="preserve">_INFORME_SUCCOR }} se concluye que {{ EL_LA_BECARIO_A }} {{ NOMBRE_PRIMERO_NOMBRES }} cumple con los supuestos establecidos en el literal a) del artículo 30 del Reglamento de la Ley Nº </w:t>
-      </w:r>
-      <w:r>
-        <w:rPr>
-          <w:rFonts w:ascii="Arial" w:hAnsi="Arial" w:cs="Arial"/>
-        </w:rPr>
-        <w:lastRenderedPageBreak/>
-        <w:t>29837 y las Disposiciones para el becario del PRONABEC, por lo tanto, resulta viable la ampliación excepcional de la duración del periodo de estudios por el semestre {{ SEMESTRE_SOLICITADO }}.</w:t>
+        <w:t>_INFORME_SUCCOR }} se concluye que {{ EL_LA_BECARIO_A }} {{ NOMBRE_PRIMERO_NOMBRES }} cumple con los supuestos establecidos en el literal a) del artículo 30 del Reglamento de la Ley Nº 29837 y las Disposiciones para el becario del PRONABEC, por lo tanto, resulta viable la ampliación excepcional de la duración del periodo de estudios por el semestre {{ SEMESTRE_SOLICITADO }}.</w:t>
       </w:r>
     </w:p>
     <w:p>
@@ -4790,73 +3982,6 @@
           <w:lang w:val="es-ES"/>
         </w:rPr>
       </w:pPr>
-    </w:p>
-    <w:p>
-      <w:pPr>
-        <w:pStyle w:val="Default"/>
-        <w:jc w:val="both"/>
-        <w:rPr>
-          <w:rFonts w:eastAsia="Arial"/>
-          <w:bCs/>
-          <w:sz w:val="20"/>
-          <w:szCs w:val="20"/>
-          <w:lang w:val="es-ES"/>
-        </w:rPr>
-      </w:pPr>
-      <w:r>
-        <w:rPr>
-          <w:rFonts w:eastAsia="Arial"/>
-          <w:bCs/>
-          <w:sz w:val="20"/>
-          <w:szCs w:val="20"/>
-          <w:lang w:val="es-ES"/>
-        </w:rPr>
-        <w:t>ASV/</w:t>
-      </w:r>
-      <w:proofErr w:type="spellStart"/>
-      <w:r>
-        <w:rPr>
-          <w:rFonts w:eastAsia="Arial"/>
-          <w:bCs/>
-          <w:sz w:val="20"/>
-          <w:szCs w:val="20"/>
-          <w:lang w:val="es-ES"/>
-        </w:rPr>
-        <w:t>j</w:t>
-      </w:r>
-      <w:r>
-        <w:rPr>
-          <w:rFonts w:eastAsia="Arial"/>
-          <w:bCs/>
-          <w:sz w:val="20"/>
-          <w:szCs w:val="20"/>
-          <w:lang w:val="es-ES"/>
-        </w:rPr>
-        <w:t>obs</w:t>
-      </w:r>
-      <w:proofErr w:type="spellEnd"/>
-      <w:r>
-        <w:rPr>
-          <w:rFonts w:eastAsia="Arial"/>
-          <w:bCs/>
-          <w:sz w:val="20"/>
-          <w:szCs w:val="20"/>
-          <w:lang w:val="es-ES"/>
-        </w:rPr>
-        <w:t>/</w:t>
-      </w:r>
-      <w:proofErr w:type="spellStart"/>
-      <w:r>
-        <w:rPr>
-          <w:rFonts w:eastAsia="Arial"/>
-          <w:bCs/>
-          <w:sz w:val="20"/>
-          <w:szCs w:val="20"/>
-          <w:lang w:val="es-ES"/>
-        </w:rPr>
-        <w:t>jgds</w:t>
-      </w:r>
-      <w:proofErr w:type="spellEnd"/>
     </w:p>
     <w:sectPr>
       <w:headerReference w:type="default" r:id="rId8"/>
@@ -10551,7 +9676,7 @@
 </file>
 
 <file path=customXml/itemProps1.xml><?xml version="1.0" encoding="utf-8"?>
-<ds:datastoreItem xmlns:ds="http://schemas.openxmlformats.org/officeDocument/2006/customXml" ds:itemID="{E9BF4672-2228-478D-BD55-E083C336109E}">
+<ds:datastoreItem xmlns:ds="http://schemas.openxmlformats.org/officeDocument/2006/customXml" ds:itemID="{ADC9997B-9B0B-4261-A8A1-935CEB169EEA}">
   <ds:schemaRefs>
     <ds:schemaRef ds:uri="http://schemas.openxmlformats.org/officeDocument/2006/bibliography"/>
   </ds:schemaRefs>

</xml_diff>